<commit_message>
add file template download add email notification
</commit_message>
<xml_diff>
--- a/自費醫療補助管理系統_需求規格書.docx
+++ b/自費醫療補助管理系統_需求規格書.docx
@@ -16562,19 +16562,19 @@
           <w:p>
             <w:pPr>
               <w:rPr>
+                <w:rFonts w:ascii="Verdana" w:eastAsia="Verdana" w:hAnsi="Verdana" w:cs="Verdana"/>
+                <w:color w:val="181818"/>
+                <w:sz w:val="24"/>
+                <w:szCs w:val="24"/>
+              </w:rPr>
+            </w:pPr>
+            <w:r>
+              <w:rPr>
                 <w:rFonts w:ascii="Verdana" w:eastAsia="Verdana" w:hAnsi="Verdana" w:cs="Verdana" w:hint="eastAsia"/>
                 <w:color w:val="181818"/>
                 <w:sz w:val="24"/>
                 <w:szCs w:val="24"/>
               </w:rPr>
-            </w:pPr>
-            <w:r>
-              <w:rPr>
-                <w:rFonts w:ascii="Verdana" w:eastAsia="Verdana" w:hAnsi="Verdana" w:cs="Verdana" w:hint="eastAsia"/>
-                <w:color w:val="181818"/>
-                <w:sz w:val="24"/>
-                <w:szCs w:val="24"/>
-              </w:rPr>
               <w:t>storage_location</w:t>
             </w:r>
           </w:p>
@@ -16636,7 +16636,7 @@
           <w:p>
             <w:pPr>
               <w:rPr>
-                <w:rFonts w:ascii="Verdana" w:eastAsia="Verdana" w:hAnsi="Verdana" w:cs="Verdana" w:hint="eastAsia"/>
+                <w:rFonts w:ascii="Verdana" w:eastAsia="Verdana" w:hAnsi="Verdana" w:cs="Verdana"/>
                 <w:color w:val="181818"/>
                 <w:sz w:val="24"/>
                 <w:szCs w:val="24"/>
@@ -22122,7 +22122,7 @@
     <w:p>
       <w:pPr>
         <w:rPr>
-          <w:rFonts w:ascii="Verdana" w:hAnsi="Verdana" w:cs="Verdana" w:hint="eastAsia"/>
+          <w:rFonts w:ascii="Verdana" w:hAnsi="Verdana" w:cs="Verdana"/>
           <w:sz w:val="24"/>
           <w:szCs w:val="24"/>
         </w:rPr>
@@ -22282,17 +22282,17 @@
           <w:p>
             <w:pPr>
               <w:rPr>
+                <w:rFonts w:ascii="Verdana" w:hAnsi="Verdana" w:cs="Verdana"/>
+                <w:sz w:val="24"/>
+                <w:szCs w:val="24"/>
+              </w:rPr>
+            </w:pPr>
+            <w:r>
+              <w:rPr>
                 <w:rFonts w:ascii="Verdana" w:hAnsi="Verdana" w:cs="Verdana" w:hint="eastAsia"/>
                 <w:sz w:val="24"/>
                 <w:szCs w:val="24"/>
               </w:rPr>
-            </w:pPr>
-            <w:r>
-              <w:rPr>
-                <w:rFonts w:ascii="Verdana" w:hAnsi="Verdana" w:cs="Verdana" w:hint="eastAsia"/>
-                <w:sz w:val="24"/>
-                <w:szCs w:val="24"/>
-              </w:rPr>
               <w:t>id</w:t>
             </w:r>
           </w:p>
@@ -22348,7 +22348,7 @@
           <w:p>
             <w:pPr>
               <w:rPr>
-                <w:rFonts w:ascii="Verdana" w:hAnsi="Verdana" w:cs="Verdana" w:hint="eastAsia"/>
+                <w:rFonts w:ascii="Verdana" w:hAnsi="Verdana" w:cs="Verdana"/>
                 <w:sz w:val="24"/>
                 <w:szCs w:val="24"/>
               </w:rPr>
@@ -22364,17 +22364,17 @@
           <w:p>
             <w:pPr>
               <w:rPr>
+                <w:rFonts w:ascii="Verdana" w:hAnsi="Verdana" w:cs="Verdana"/>
+                <w:sz w:val="24"/>
+                <w:szCs w:val="24"/>
+              </w:rPr>
+            </w:pPr>
+            <w:r>
+              <w:rPr>
                 <w:rFonts w:ascii="Verdana" w:hAnsi="Verdana" w:cs="Verdana" w:hint="eastAsia"/>
                 <w:sz w:val="24"/>
                 <w:szCs w:val="24"/>
               </w:rPr>
-            </w:pPr>
-            <w:r>
-              <w:rPr>
-                <w:rFonts w:ascii="Verdana" w:hAnsi="Verdana" w:cs="Verdana" w:hint="eastAsia"/>
-                <w:sz w:val="24"/>
-                <w:szCs w:val="24"/>
-              </w:rPr>
               <w:t>parent_id</w:t>
             </w:r>
           </w:p>
@@ -22418,7 +22418,7 @@
           <w:p>
             <w:pPr>
               <w:rPr>
-                <w:rFonts w:ascii="Verdana" w:hAnsi="Verdana" w:cs="Verdana" w:hint="eastAsia"/>
+                <w:rFonts w:ascii="Verdana" w:hAnsi="Verdana" w:cs="Verdana"/>
                 <w:sz w:val="24"/>
                 <w:szCs w:val="24"/>
               </w:rPr>
@@ -22464,17 +22464,17 @@
           <w:p>
             <w:pPr>
               <w:rPr>
+                <w:rFonts w:ascii="Verdana" w:hAnsi="Verdana" w:cs="Verdana"/>
+                <w:sz w:val="24"/>
+                <w:szCs w:val="24"/>
+              </w:rPr>
+            </w:pPr>
+            <w:r>
+              <w:rPr>
                 <w:rFonts w:ascii="Verdana" w:hAnsi="Verdana" w:cs="Verdana" w:hint="eastAsia"/>
                 <w:sz w:val="24"/>
                 <w:szCs w:val="24"/>
               </w:rPr>
-            </w:pPr>
-            <w:r>
-              <w:rPr>
-                <w:rFonts w:ascii="Verdana" w:hAnsi="Verdana" w:cs="Verdana" w:hint="eastAsia"/>
-                <w:sz w:val="24"/>
-                <w:szCs w:val="24"/>
-              </w:rPr>
               <w:t>location_name</w:t>
             </w:r>
           </w:p>
@@ -22508,7 +22508,7 @@
           <w:p>
             <w:pPr>
               <w:rPr>
-                <w:rFonts w:ascii="Verdana" w:hAnsi="Verdana" w:cs="Verdana" w:hint="eastAsia"/>
+                <w:rFonts w:ascii="Verdana" w:hAnsi="Verdana" w:cs="Verdana"/>
                 <w:sz w:val="24"/>
                 <w:szCs w:val="24"/>
               </w:rPr>
@@ -22546,10 +22546,54 @@
           <w:p>
             <w:pPr>
               <w:rPr>
+                <w:rFonts w:ascii="Verdana" w:hAnsi="Verdana" w:cs="Verdana"/>
+                <w:sz w:val="24"/>
+                <w:szCs w:val="24"/>
+              </w:rPr>
+            </w:pPr>
+            <w:r>
+              <w:rPr>
                 <w:rFonts w:ascii="Verdana" w:hAnsi="Verdana" w:cs="Verdana" w:hint="eastAsia"/>
                 <w:sz w:val="24"/>
                 <w:szCs w:val="24"/>
               </w:rPr>
+              <w:t>status</w:t>
+            </w:r>
+          </w:p>
+        </w:tc>
+        <w:tc>
+          <w:tcPr>
+            <w:tcW w:w="2255" w:type="dxa"/>
+          </w:tcPr>
+          <w:p>
+            <w:pPr>
+              <w:rPr>
+                <w:rFonts w:ascii="Verdana" w:eastAsia="Verdana" w:hAnsi="Verdana" w:cs="Verdana"/>
+                <w:sz w:val="24"/>
+                <w:szCs w:val="24"/>
+              </w:rPr>
+            </w:pPr>
+            <w:r>
+              <w:rPr>
+                <w:rFonts w:ascii="新細明體" w:eastAsia="新細明體" w:hAnsi="新細明體" w:cs="新細明體" w:hint="eastAsia"/>
+                <w:sz w:val="24"/>
+                <w:szCs w:val="24"/>
+              </w:rPr>
+              <w:t>狀態</w:t>
+            </w:r>
+          </w:p>
+        </w:tc>
+        <w:tc>
+          <w:tcPr>
+            <w:tcW w:w="2255" w:type="dxa"/>
+          </w:tcPr>
+          <w:p>
+            <w:pPr>
+              <w:rPr>
+                <w:rFonts w:ascii="Verdana" w:hAnsi="Verdana" w:cs="Verdana"/>
+                <w:sz w:val="24"/>
+                <w:szCs w:val="24"/>
+              </w:rPr>
             </w:pPr>
             <w:r>
               <w:rPr>
@@ -22557,7 +22601,7 @@
                 <w:sz w:val="24"/>
                 <w:szCs w:val="24"/>
               </w:rPr>
-              <w:t>status</w:t>
+              <w:t>INT2</w:t>
             </w:r>
           </w:p>
         </w:tc>
@@ -22569,50 +22613,6 @@
             <w:pPr>
               <w:rPr>
                 <w:rFonts w:ascii="Verdana" w:eastAsia="Verdana" w:hAnsi="Verdana" w:cs="Verdana"/>
-                <w:sz w:val="24"/>
-                <w:szCs w:val="24"/>
-              </w:rPr>
-            </w:pPr>
-            <w:r>
-              <w:rPr>
-                <w:rFonts w:ascii="新細明體" w:eastAsia="新細明體" w:hAnsi="新細明體" w:cs="新細明體" w:hint="eastAsia"/>
-                <w:sz w:val="24"/>
-                <w:szCs w:val="24"/>
-              </w:rPr>
-              <w:t>狀態</w:t>
-            </w:r>
-          </w:p>
-        </w:tc>
-        <w:tc>
-          <w:tcPr>
-            <w:tcW w:w="2255" w:type="dxa"/>
-          </w:tcPr>
-          <w:p>
-            <w:pPr>
-              <w:rPr>
-                <w:rFonts w:ascii="Verdana" w:hAnsi="Verdana" w:cs="Verdana" w:hint="eastAsia"/>
-                <w:sz w:val="24"/>
-                <w:szCs w:val="24"/>
-              </w:rPr>
-            </w:pPr>
-            <w:r>
-              <w:rPr>
-                <w:rFonts w:ascii="Verdana" w:hAnsi="Verdana" w:cs="Verdana" w:hint="eastAsia"/>
-                <w:sz w:val="24"/>
-                <w:szCs w:val="24"/>
-              </w:rPr>
-              <w:t>INT2</w:t>
-            </w:r>
-          </w:p>
-        </w:tc>
-        <w:tc>
-          <w:tcPr>
-            <w:tcW w:w="2255" w:type="dxa"/>
-          </w:tcPr>
-          <w:p>
-            <w:pPr>
-              <w:rPr>
-                <w:rFonts w:ascii="Verdana" w:eastAsia="Verdana" w:hAnsi="Verdana" w:cs="Verdana" w:hint="eastAsia"/>
                 <w:sz w:val="24"/>
                 <w:szCs w:val="24"/>
               </w:rPr>
@@ -22636,17 +22636,17 @@
           <w:p>
             <w:pPr>
               <w:rPr>
+                <w:rFonts w:ascii="Verdana" w:hAnsi="Verdana" w:cs="Verdana"/>
+                <w:sz w:val="24"/>
+                <w:szCs w:val="24"/>
+              </w:rPr>
+            </w:pPr>
+            <w:r>
+              <w:rPr>
                 <w:rFonts w:ascii="Verdana" w:hAnsi="Verdana" w:cs="Verdana" w:hint="eastAsia"/>
                 <w:sz w:val="24"/>
                 <w:szCs w:val="24"/>
               </w:rPr>
-            </w:pPr>
-            <w:r>
-              <w:rPr>
-                <w:rFonts w:ascii="Verdana" w:hAnsi="Verdana" w:cs="Verdana" w:hint="eastAsia"/>
-                <w:sz w:val="24"/>
-                <w:szCs w:val="24"/>
-              </w:rPr>
               <w:t>description</w:t>
             </w:r>
           </w:p>
@@ -22680,7 +22680,7 @@
           <w:p>
             <w:pPr>
               <w:rPr>
-                <w:rFonts w:ascii="Verdana" w:hAnsi="Verdana" w:cs="Verdana" w:hint="eastAsia"/>
+                <w:rFonts w:ascii="Verdana" w:hAnsi="Verdana" w:cs="Verdana"/>
                 <w:sz w:val="24"/>
                 <w:szCs w:val="24"/>
               </w:rPr>
@@ -22718,17 +22718,17 @@
           <w:p>
             <w:pPr>
               <w:rPr>
+                <w:rFonts w:ascii="Verdana" w:hAnsi="Verdana" w:cs="Verdana"/>
+                <w:sz w:val="24"/>
+                <w:szCs w:val="24"/>
+              </w:rPr>
+            </w:pPr>
+            <w:r>
+              <w:rPr>
                 <w:rFonts w:ascii="Verdana" w:hAnsi="Verdana" w:cs="Verdana" w:hint="eastAsia"/>
                 <w:sz w:val="24"/>
                 <w:szCs w:val="24"/>
               </w:rPr>
-            </w:pPr>
-            <w:r>
-              <w:rPr>
-                <w:rFonts w:ascii="Verdana" w:hAnsi="Verdana" w:cs="Verdana" w:hint="eastAsia"/>
-                <w:sz w:val="24"/>
-                <w:szCs w:val="24"/>
-              </w:rPr>
               <w:t>created_at</w:t>
             </w:r>
           </w:p>
@@ -22784,7 +22784,7 @@
           <w:p>
             <w:pPr>
               <w:rPr>
-                <w:rFonts w:ascii="Verdana" w:hAnsi="Verdana" w:cs="Verdana" w:hint="eastAsia"/>
+                <w:rFonts w:ascii="Verdana" w:hAnsi="Verdana" w:cs="Verdana"/>
                 <w:sz w:val="24"/>
                 <w:szCs w:val="24"/>
               </w:rPr>
@@ -22808,7 +22808,7 @@
           <w:p>
             <w:pPr>
               <w:rPr>
-                <w:rFonts w:ascii="Verdana" w:hAnsi="Verdana" w:cs="Verdana" w:hint="eastAsia"/>
+                <w:rFonts w:ascii="Verdana" w:hAnsi="Verdana" w:cs="Verdana"/>
                 <w:sz w:val="24"/>
                 <w:szCs w:val="24"/>
               </w:rPr>
@@ -22923,15 +22923,2117 @@
           <w:sz w:val="24"/>
           <w:szCs w:val="24"/>
         </w:rPr>
-        <w:t>9.系統操作歷程紀錄表 (system_logs)</w:t>
+        <w:t>9.系統操作歷程紀錄表 (</w:t>
+      </w:r>
+      <w:r>
+        <w:rPr>
+          <w:rFonts w:ascii="新細明體" w:eastAsia="新細明體" w:hAnsi="新細明體" w:cs="新細明體" w:hint="eastAsia"/>
+          <w:sz w:val="24"/>
+          <w:szCs w:val="24"/>
+        </w:rPr>
+        <w:t>audit</w:t>
+      </w:r>
+      <w:r>
+        <w:rPr>
+          <w:rFonts w:ascii="Arial Unicode MS" w:eastAsia="Arial Unicode MS" w:hAnsi="Arial Unicode MS" w:cs="Arial Unicode MS"/>
+          <w:sz w:val="24"/>
+          <w:szCs w:val="24"/>
+        </w:rPr>
+        <w:t>_logs)</w:t>
       </w:r>
     </w:p>
+    <w:tbl>
+      <w:tblPr>
+        <w:tblStyle w:val="ad"/>
+        <w:tblW w:w="0" w:type="auto"/>
+        <w:tblLook w:val="04A0" w:firstRow="1" w:lastRow="0" w:firstColumn="1" w:lastColumn="0" w:noHBand="0" w:noVBand="1"/>
+      </w:tblPr>
+      <w:tblGrid>
+        <w:gridCol w:w="1751"/>
+        <w:gridCol w:w="1291"/>
+        <w:gridCol w:w="1798"/>
+        <w:gridCol w:w="4179"/>
+      </w:tblGrid>
+      <w:tr>
+        <w:tc>
+          <w:tcPr>
+            <w:tcW w:w="2254" w:type="dxa"/>
+            <w:shd w:val="clear" w:color="auto" w:fill="D9D9D9" w:themeFill="background1" w:themeFillShade="D9"/>
+            <w:vAlign w:val="center"/>
+          </w:tcPr>
+          <w:p>
+            <w:pPr>
+              <w:rPr>
+                <w:rFonts w:ascii="Verdana" w:eastAsia="Verdana" w:hAnsi="Verdana" w:cs="Verdana"/>
+                <w:sz w:val="24"/>
+                <w:szCs w:val="24"/>
+              </w:rPr>
+            </w:pPr>
+            <w:r>
+              <w:rPr>
+                <w:rFonts w:ascii="Arial Unicode MS" w:eastAsia="Arial Unicode MS" w:hAnsi="Arial Unicode MS" w:cs="Arial Unicode MS"/>
+                <w:b/>
+                <w:bCs/>
+                <w:color w:val="181818"/>
+                <w:sz w:val="24"/>
+                <w:szCs w:val="24"/>
+              </w:rPr>
+              <w:t>英文欄位名稱</w:t>
+            </w:r>
+          </w:p>
+        </w:tc>
+        <w:tc>
+          <w:tcPr>
+            <w:tcW w:w="2255" w:type="dxa"/>
+            <w:shd w:val="clear" w:color="auto" w:fill="D9D9D9" w:themeFill="background1" w:themeFillShade="D9"/>
+            <w:vAlign w:val="center"/>
+          </w:tcPr>
+          <w:p>
+            <w:pPr>
+              <w:rPr>
+                <w:rFonts w:ascii="Verdana" w:eastAsia="Verdana" w:hAnsi="Verdana" w:cs="Verdana"/>
+                <w:sz w:val="24"/>
+                <w:szCs w:val="24"/>
+              </w:rPr>
+            </w:pPr>
+            <w:r>
+              <w:rPr>
+                <w:rFonts w:ascii="Arial Unicode MS" w:eastAsia="Arial Unicode MS" w:hAnsi="Arial Unicode MS" w:cs="Arial Unicode MS"/>
+                <w:b/>
+                <w:bCs/>
+                <w:color w:val="181818"/>
+                <w:sz w:val="24"/>
+                <w:szCs w:val="24"/>
+              </w:rPr>
+              <w:t>中文名稱</w:t>
+            </w:r>
+          </w:p>
+        </w:tc>
+        <w:tc>
+          <w:tcPr>
+            <w:tcW w:w="2255" w:type="dxa"/>
+            <w:shd w:val="clear" w:color="auto" w:fill="D9D9D9" w:themeFill="background1" w:themeFillShade="D9"/>
+            <w:vAlign w:val="center"/>
+          </w:tcPr>
+          <w:p>
+            <w:pPr>
+              <w:rPr>
+                <w:rFonts w:ascii="Verdana" w:eastAsia="Verdana" w:hAnsi="Verdana" w:cs="Verdana"/>
+                <w:sz w:val="24"/>
+                <w:szCs w:val="24"/>
+              </w:rPr>
+            </w:pPr>
+            <w:r>
+              <w:rPr>
+                <w:rFonts w:ascii="Arial Unicode MS" w:eastAsia="Arial Unicode MS" w:hAnsi="Arial Unicode MS" w:cs="Arial Unicode MS"/>
+                <w:b/>
+                <w:bCs/>
+                <w:color w:val="181818"/>
+                <w:sz w:val="24"/>
+                <w:szCs w:val="24"/>
+              </w:rPr>
+              <w:t>資料格式</w:t>
+            </w:r>
+          </w:p>
+        </w:tc>
+        <w:tc>
+          <w:tcPr>
+            <w:tcW w:w="2255" w:type="dxa"/>
+            <w:shd w:val="clear" w:color="auto" w:fill="D9D9D9" w:themeFill="background1" w:themeFillShade="D9"/>
+            <w:vAlign w:val="center"/>
+          </w:tcPr>
+          <w:p>
+            <w:pPr>
+              <w:rPr>
+                <w:rFonts w:ascii="Verdana" w:eastAsia="Verdana" w:hAnsi="Verdana" w:cs="Verdana"/>
+                <w:sz w:val="24"/>
+                <w:szCs w:val="24"/>
+              </w:rPr>
+            </w:pPr>
+            <w:r>
+              <w:rPr>
+                <w:rFonts w:ascii="Arial Unicode MS" w:eastAsia="Arial Unicode MS" w:hAnsi="Arial Unicode MS" w:cs="Arial Unicode MS"/>
+                <w:b/>
+                <w:bCs/>
+                <w:color w:val="181818"/>
+                <w:sz w:val="24"/>
+                <w:szCs w:val="24"/>
+              </w:rPr>
+              <w:t>說明 / 備註</w:t>
+            </w:r>
+          </w:p>
+        </w:tc>
+      </w:tr>
+      <w:tr>
+        <w:tc>
+          <w:tcPr>
+            <w:tcW w:w="2254" w:type="dxa"/>
+          </w:tcPr>
+          <w:p>
+            <w:pPr>
+              <w:rPr>
+                <w:rFonts w:ascii="Verdana" w:hAnsi="Verdana" w:cs="Verdana"/>
+                <w:sz w:val="24"/>
+                <w:szCs w:val="24"/>
+              </w:rPr>
+            </w:pPr>
+            <w:r>
+              <w:t>id</w:t>
+            </w:r>
+          </w:p>
+        </w:tc>
+        <w:tc>
+          <w:tcPr>
+            <w:tcW w:w="2255" w:type="dxa"/>
+            <w:vAlign w:val="center"/>
+          </w:tcPr>
+          <w:p>
+            <w:pPr>
+              <w:rPr>
+                <w:rFonts w:ascii="Verdana" w:eastAsia="Verdana" w:hAnsi="Verdana" w:cs="Verdana"/>
+                <w:sz w:val="24"/>
+                <w:szCs w:val="24"/>
+                <w:lang w:val="en-US"/>
+              </w:rPr>
+            </w:pPr>
+            <w:r>
+              <w:rPr>
+                <w:rFonts w:ascii="Segoe UI" w:hAnsi="Segoe UI" w:cs="Segoe UI"/>
+                <w:color w:val="1F2328"/>
+                <w:sz w:val="16"/>
+                <w:szCs w:val="16"/>
+              </w:rPr>
+              <w:t>紀錄編號</w:t>
+            </w:r>
+          </w:p>
+        </w:tc>
+        <w:tc>
+          <w:tcPr>
+            <w:tcW w:w="2255" w:type="dxa"/>
+          </w:tcPr>
+          <w:p>
+            <w:pPr>
+              <w:rPr>
+                <w:rFonts w:ascii="Verdana" w:hAnsi="Verdana" w:cs="Verdana" w:hint="eastAsia"/>
+                <w:sz w:val="24"/>
+                <w:szCs w:val="24"/>
+                <w:lang w:val="en-US"/>
+              </w:rPr>
+            </w:pPr>
+            <w:r>
+              <w:t>int8</w:t>
+            </w:r>
+          </w:p>
+        </w:tc>
+        <w:tc>
+          <w:tcPr>
+            <w:tcW w:w="2255" w:type="dxa"/>
+          </w:tcPr>
+          <w:p>
+            <w:pPr>
+              <w:rPr>
+                <w:rFonts w:ascii="Verdana" w:hAnsi="Verdana" w:cs="Verdana"/>
+                <w:sz w:val="24"/>
+                <w:szCs w:val="24"/>
+                <w:lang w:val="en-US"/>
+              </w:rPr>
+            </w:pPr>
+            <w:r>
+              <w:rPr>
+                <w:rFonts w:ascii="Verdana" w:hAnsi="Verdana" w:cs="Verdana" w:hint="eastAsia"/>
+                <w:sz w:val="24"/>
+                <w:szCs w:val="24"/>
+                <w:lang w:val="en-US"/>
+              </w:rPr>
+              <w:t>自動遞增整數</w:t>
+            </w:r>
+          </w:p>
+        </w:tc>
+      </w:tr>
+      <w:tr>
+        <w:tc>
+          <w:tcPr>
+            <w:tcW w:w="2254" w:type="dxa"/>
+          </w:tcPr>
+          <w:p>
+            <w:pPr>
+              <w:rPr>
+                <w:rFonts w:ascii="Verdana" w:hAnsi="Verdana" w:cs="Verdana"/>
+                <w:sz w:val="24"/>
+                <w:szCs w:val="24"/>
+                <w:lang w:val="en-US"/>
+              </w:rPr>
+            </w:pPr>
+            <w:r>
+              <w:t>created_at</w:t>
+            </w:r>
+          </w:p>
+        </w:tc>
+        <w:tc>
+          <w:tcPr>
+            <w:tcW w:w="2255" w:type="dxa"/>
+            <w:vAlign w:val="center"/>
+          </w:tcPr>
+          <w:p>
+            <w:pPr>
+              <w:rPr>
+                <w:rFonts w:ascii="Verdana" w:eastAsia="Verdana" w:hAnsi="Verdana" w:cs="Verdana"/>
+                <w:sz w:val="24"/>
+                <w:szCs w:val="24"/>
+                <w:lang w:val="en-US"/>
+              </w:rPr>
+            </w:pPr>
+            <w:r>
+              <w:rPr>
+                <w:rFonts w:ascii="Segoe UI" w:hAnsi="Segoe UI" w:cs="Segoe UI"/>
+                <w:color w:val="1F2328"/>
+                <w:sz w:val="16"/>
+                <w:szCs w:val="16"/>
+              </w:rPr>
+              <w:t>操作時間</w:t>
+            </w:r>
+          </w:p>
+        </w:tc>
+        <w:tc>
+          <w:tcPr>
+            <w:tcW w:w="2255" w:type="dxa"/>
+          </w:tcPr>
+          <w:p>
+            <w:pPr>
+              <w:rPr>
+                <w:rFonts w:ascii="Verdana" w:hAnsi="Verdana" w:cs="Verdana"/>
+                <w:sz w:val="24"/>
+                <w:szCs w:val="24"/>
+                <w:lang w:val="en-US"/>
+              </w:rPr>
+            </w:pPr>
+            <w:r>
+              <w:t>timestamptz</w:t>
+            </w:r>
+          </w:p>
+        </w:tc>
+        <w:tc>
+          <w:tcPr>
+            <w:tcW w:w="2255" w:type="dxa"/>
+          </w:tcPr>
+          <w:p>
+            <w:pPr>
+              <w:rPr>
+                <w:rFonts w:ascii="Verdana" w:eastAsia="Verdana" w:hAnsi="Verdana" w:cs="Verdana"/>
+                <w:sz w:val="24"/>
+                <w:szCs w:val="24"/>
+                <w:lang w:val="en-US"/>
+              </w:rPr>
+            </w:pPr>
+            <w:r>
+              <w:rPr>
+                <w:rFonts w:ascii="新細明體" w:eastAsia="新細明體" w:hAnsi="新細明體" w:cs="新細明體" w:hint="eastAsia"/>
+                <w:sz w:val="24"/>
+                <w:szCs w:val="24"/>
+                <w:lang w:val="en-US"/>
+              </w:rPr>
+              <w:t>含時區時間戳記</w:t>
+            </w:r>
+          </w:p>
+        </w:tc>
+      </w:tr>
+      <w:tr>
+        <w:tc>
+          <w:tcPr>
+            <w:tcW w:w="2254" w:type="dxa"/>
+          </w:tcPr>
+          <w:p>
+            <w:pPr>
+              <w:rPr>
+                <w:rFonts w:ascii="Verdana" w:hAnsi="Verdana" w:cs="Verdana"/>
+                <w:sz w:val="24"/>
+                <w:szCs w:val="24"/>
+                <w:lang w:val="en-US"/>
+              </w:rPr>
+            </w:pPr>
+            <w:r>
+              <w:t>user_id</w:t>
+            </w:r>
+          </w:p>
+        </w:tc>
+        <w:tc>
+          <w:tcPr>
+            <w:tcW w:w="2255" w:type="dxa"/>
+            <w:vAlign w:val="center"/>
+          </w:tcPr>
+          <w:p>
+            <w:pPr>
+              <w:rPr>
+                <w:rFonts w:ascii="Verdana" w:eastAsia="Verdana" w:hAnsi="Verdana" w:cs="Verdana"/>
+                <w:sz w:val="24"/>
+                <w:szCs w:val="24"/>
+                <w:lang w:val="en-US"/>
+              </w:rPr>
+            </w:pPr>
+            <w:r>
+              <w:rPr>
+                <w:rFonts w:ascii="Segoe UI" w:hAnsi="Segoe UI" w:cs="Segoe UI"/>
+                <w:color w:val="1F2328"/>
+                <w:sz w:val="16"/>
+                <w:szCs w:val="16"/>
+              </w:rPr>
+              <w:t>操作者</w:t>
+            </w:r>
+            <w:r>
+              <w:rPr>
+                <w:rFonts w:ascii="Segoe UI" w:hAnsi="Segoe UI" w:cs="Segoe UI"/>
+                <w:color w:val="1F2328"/>
+                <w:sz w:val="16"/>
+                <w:szCs w:val="16"/>
+              </w:rPr>
+              <w:t xml:space="preserve"> ID</w:t>
+            </w:r>
+          </w:p>
+        </w:tc>
+        <w:tc>
+          <w:tcPr>
+            <w:tcW w:w="2255" w:type="dxa"/>
+          </w:tcPr>
+          <w:p>
+            <w:pPr>
+              <w:rPr>
+                <w:rFonts w:ascii="Verdana" w:hAnsi="Verdana" w:cs="Verdana"/>
+                <w:sz w:val="24"/>
+                <w:szCs w:val="24"/>
+                <w:lang w:val="en-US"/>
+              </w:rPr>
+            </w:pPr>
+            <w:r>
+              <w:t>uuid</w:t>
+            </w:r>
+          </w:p>
+        </w:tc>
+        <w:tc>
+          <w:tcPr>
+            <w:tcW w:w="2255" w:type="dxa"/>
+          </w:tcPr>
+          <w:p>
+            <w:pPr>
+              <w:rPr>
+                <w:rFonts w:ascii="Verdana" w:hAnsi="Verdana" w:cs="Verdana" w:hint="eastAsia"/>
+                <w:sz w:val="24"/>
+                <w:szCs w:val="24"/>
+                <w:lang w:val="en-US"/>
+              </w:rPr>
+            </w:pPr>
+            <w:r>
+              <w:rPr>
+                <w:rFonts w:ascii="Verdana" w:hAnsi="Verdana" w:cs="Verdana" w:hint="eastAsia"/>
+                <w:sz w:val="24"/>
+                <w:szCs w:val="24"/>
+                <w:lang w:val="en-US"/>
+              </w:rPr>
+              <w:t>Nullable</w:t>
+            </w:r>
+          </w:p>
+        </w:tc>
+      </w:tr>
+      <w:tr>
+        <w:tc>
+          <w:tcPr>
+            <w:tcW w:w="2254" w:type="dxa"/>
+          </w:tcPr>
+          <w:p>
+            <w:pPr>
+              <w:rPr>
+                <w:rFonts w:ascii="Verdana" w:hAnsi="Verdana" w:cs="Verdana"/>
+                <w:sz w:val="24"/>
+                <w:szCs w:val="24"/>
+                <w:lang w:val="en-US"/>
+              </w:rPr>
+            </w:pPr>
+            <w:r>
+              <w:t>action</w:t>
+            </w:r>
+          </w:p>
+        </w:tc>
+        <w:tc>
+          <w:tcPr>
+            <w:tcW w:w="2255" w:type="dxa"/>
+            <w:vAlign w:val="center"/>
+          </w:tcPr>
+          <w:p>
+            <w:pPr>
+              <w:rPr>
+                <w:rFonts w:ascii="Verdana" w:eastAsia="Verdana" w:hAnsi="Verdana" w:cs="Verdana"/>
+                <w:sz w:val="24"/>
+                <w:szCs w:val="24"/>
+                <w:lang w:val="en-US"/>
+              </w:rPr>
+            </w:pPr>
+            <w:r>
+              <w:rPr>
+                <w:rFonts w:ascii="Segoe UI" w:hAnsi="Segoe UI" w:cs="Segoe UI"/>
+                <w:color w:val="1F2328"/>
+                <w:sz w:val="16"/>
+                <w:szCs w:val="16"/>
+              </w:rPr>
+              <w:t>動作類型</w:t>
+            </w:r>
+          </w:p>
+        </w:tc>
+        <w:tc>
+          <w:tcPr>
+            <w:tcW w:w="2255" w:type="dxa"/>
+          </w:tcPr>
+          <w:p>
+            <w:pPr>
+              <w:rPr>
+                <w:rFonts w:ascii="Verdana" w:hAnsi="Verdana" w:cs="Verdana" w:hint="eastAsia"/>
+                <w:sz w:val="24"/>
+                <w:szCs w:val="24"/>
+                <w:lang w:val="en-US"/>
+              </w:rPr>
+            </w:pPr>
+            <w:r>
+              <w:t>varchar</w:t>
+            </w:r>
+          </w:p>
+        </w:tc>
+        <w:tc>
+          <w:tcPr>
+            <w:tcW w:w="2255" w:type="dxa"/>
+          </w:tcPr>
+          <w:tbl>
+            <w:tblPr>
+              <w:tblW w:w="3963" w:type="dxa"/>
+              <w:tblCellMar>
+                <w:left w:w="28" w:type="dxa"/>
+                <w:right w:w="28" w:type="dxa"/>
+              </w:tblCellMar>
+              <w:tblLook w:val="04A0" w:firstRow="1" w:lastRow="0" w:firstColumn="1" w:lastColumn="0" w:noHBand="0" w:noVBand="1"/>
+            </w:tblPr>
+            <w:tblGrid>
+              <w:gridCol w:w="3963"/>
+            </w:tblGrid>
+            <w:tr>
+              <w:trPr>
+                <w:trHeight w:val="710"/>
+              </w:trPr>
+              <w:tc>
+                <w:tcPr>
+                  <w:tcW w:w="3963" w:type="dxa"/>
+                  <w:tcBorders>
+                    <w:top w:val="nil"/>
+                    <w:left w:val="nil"/>
+                    <w:bottom w:val="nil"/>
+                    <w:right w:val="nil"/>
+                  </w:tcBorders>
+                  <w:shd w:val="clear" w:color="auto" w:fill="auto"/>
+                  <w:noWrap/>
+                  <w:vAlign w:val="center"/>
+                  <w:hideMark/>
+                </w:tcPr>
+                <w:p>
+                  <w:pPr>
+                    <w:spacing w:line="240" w:lineRule="auto"/>
+                    <w:rPr>
+                      <w:rFonts w:ascii="新細明體" w:eastAsia="新細明體" w:hAnsi="新細明體" w:cs="新細明體"/>
+                      <w:color w:val="000000"/>
+                      <w:sz w:val="24"/>
+                      <w:szCs w:val="24"/>
+                      <w:lang w:val="en-US"/>
+                    </w:rPr>
+                  </w:pPr>
+                  <w:proofErr w:type="spellStart"/>
+                  <w:r>
+                    <w:rPr>
+                      <w:rFonts w:ascii="新細明體" w:eastAsia="新細明體" w:hAnsi="新細明體" w:cs="新細明體" w:hint="eastAsia"/>
+                      <w:color w:val="000000"/>
+                      <w:sz w:val="24"/>
+                      <w:szCs w:val="24"/>
+                      <w:lang w:val="en-US"/>
+                    </w:rPr>
+                    <w:t>application.create</w:t>
+                  </w:r>
+                  <w:proofErr w:type="spellEnd"/>
+                  <w:r>
+                    <w:rPr>
+                      <w:rFonts w:ascii="新細明體" w:eastAsia="新細明體" w:hAnsi="新細明體" w:cs="新細明體" w:hint="eastAsia"/>
+                      <w:color w:val="000000"/>
+                      <w:sz w:val="24"/>
+                      <w:szCs w:val="24"/>
+                      <w:lang w:val="en-US"/>
+                    </w:rPr>
+                    <w:t xml:space="preserve"> 新增申請案件</w:t>
+                  </w:r>
+                </w:p>
+              </w:tc>
+            </w:tr>
+            <w:tr>
+              <w:trPr>
+                <w:trHeight w:val="710"/>
+              </w:trPr>
+              <w:tc>
+                <w:tcPr>
+                  <w:tcW w:w="3963" w:type="dxa"/>
+                  <w:tcBorders>
+                    <w:top w:val="nil"/>
+                    <w:left w:val="nil"/>
+                    <w:bottom w:val="nil"/>
+                    <w:right w:val="nil"/>
+                  </w:tcBorders>
+                  <w:shd w:val="clear" w:color="auto" w:fill="auto"/>
+                  <w:noWrap/>
+                  <w:vAlign w:val="center"/>
+                  <w:hideMark/>
+                </w:tcPr>
+                <w:p>
+                  <w:pPr>
+                    <w:spacing w:line="240" w:lineRule="auto"/>
+                    <w:rPr>
+                      <w:rFonts w:ascii="新細明體" w:eastAsia="新細明體" w:hAnsi="新細明體" w:cs="新細明體" w:hint="eastAsia"/>
+                      <w:color w:val="000000"/>
+                      <w:sz w:val="24"/>
+                      <w:szCs w:val="24"/>
+                      <w:lang w:val="en-US"/>
+                    </w:rPr>
+                  </w:pPr>
+                  <w:proofErr w:type="spellStart"/>
+                  <w:r>
+                    <w:rPr>
+                      <w:rFonts w:ascii="新細明體" w:eastAsia="新細明體" w:hAnsi="新細明體" w:cs="新細明體" w:hint="eastAsia"/>
+                      <w:color w:val="000000"/>
+                      <w:sz w:val="24"/>
+                      <w:szCs w:val="24"/>
+                      <w:lang w:val="en-US"/>
+                    </w:rPr>
+                    <w:t>application.update</w:t>
+                  </w:r>
+                  <w:proofErr w:type="spellEnd"/>
+                  <w:r>
+                    <w:rPr>
+                      <w:rFonts w:ascii="新細明體" w:eastAsia="新細明體" w:hAnsi="新細明體" w:cs="新細明體" w:hint="eastAsia"/>
+                      <w:color w:val="000000"/>
+                      <w:sz w:val="24"/>
+                      <w:szCs w:val="24"/>
+                      <w:lang w:val="en-US"/>
+                    </w:rPr>
+                    <w:t xml:space="preserve"> 修改申請資料</w:t>
+                  </w:r>
+                </w:p>
+              </w:tc>
+            </w:tr>
+            <w:tr>
+              <w:trPr>
+                <w:trHeight w:val="710"/>
+              </w:trPr>
+              <w:tc>
+                <w:tcPr>
+                  <w:tcW w:w="3963" w:type="dxa"/>
+                  <w:tcBorders>
+                    <w:top w:val="nil"/>
+                    <w:left w:val="nil"/>
+                    <w:bottom w:val="nil"/>
+                    <w:right w:val="nil"/>
+                  </w:tcBorders>
+                  <w:shd w:val="clear" w:color="auto" w:fill="auto"/>
+                  <w:noWrap/>
+                  <w:vAlign w:val="center"/>
+                  <w:hideMark/>
+                </w:tcPr>
+                <w:p>
+                  <w:pPr>
+                    <w:spacing w:line="240" w:lineRule="auto"/>
+                    <w:rPr>
+                      <w:rFonts w:ascii="新細明體" w:eastAsia="新細明體" w:hAnsi="新細明體" w:cs="新細明體" w:hint="eastAsia"/>
+                      <w:color w:val="000000"/>
+                      <w:sz w:val="24"/>
+                      <w:szCs w:val="24"/>
+                      <w:lang w:val="en-US"/>
+                    </w:rPr>
+                  </w:pPr>
+                  <w:proofErr w:type="spellStart"/>
+                  <w:r>
+                    <w:rPr>
+                      <w:rFonts w:ascii="新細明體" w:eastAsia="新細明體" w:hAnsi="新細明體" w:cs="新細明體" w:hint="eastAsia"/>
+                      <w:color w:val="000000"/>
+                      <w:sz w:val="24"/>
+                      <w:szCs w:val="24"/>
+                      <w:lang w:val="en-US"/>
+                    </w:rPr>
+                    <w:t>application.stage_advance</w:t>
+                  </w:r>
+                  <w:proofErr w:type="spellEnd"/>
+                  <w:r>
+                    <w:rPr>
+                      <w:rFonts w:ascii="新細明體" w:eastAsia="新細明體" w:hAnsi="新細明體" w:cs="新細明體" w:hint="eastAsia"/>
+                      <w:color w:val="000000"/>
+                      <w:sz w:val="24"/>
+                      <w:szCs w:val="24"/>
+                      <w:lang w:val="en-US"/>
+                    </w:rPr>
+                    <w:t xml:space="preserve"> 推進申請階段</w:t>
+                  </w:r>
+                </w:p>
+              </w:tc>
+            </w:tr>
+            <w:tr>
+              <w:trPr>
+                <w:trHeight w:val="710"/>
+              </w:trPr>
+              <w:tc>
+                <w:tcPr>
+                  <w:tcW w:w="3963" w:type="dxa"/>
+                  <w:tcBorders>
+                    <w:top w:val="nil"/>
+                    <w:left w:val="nil"/>
+                    <w:bottom w:val="nil"/>
+                    <w:right w:val="nil"/>
+                  </w:tcBorders>
+                  <w:shd w:val="clear" w:color="auto" w:fill="auto"/>
+                  <w:noWrap/>
+                  <w:vAlign w:val="center"/>
+                  <w:hideMark/>
+                </w:tcPr>
+                <w:p>
+                  <w:pPr>
+                    <w:spacing w:line="240" w:lineRule="auto"/>
+                    <w:rPr>
+                      <w:rFonts w:ascii="新細明體" w:eastAsia="新細明體" w:hAnsi="新細明體" w:cs="新細明體" w:hint="eastAsia"/>
+                      <w:color w:val="000000"/>
+                      <w:sz w:val="24"/>
+                      <w:szCs w:val="24"/>
+                      <w:lang w:val="en-US"/>
+                    </w:rPr>
+                  </w:pPr>
+                  <w:proofErr w:type="spellStart"/>
+                  <w:r>
+                    <w:rPr>
+                      <w:rFonts w:ascii="新細明體" w:eastAsia="新細明體" w:hAnsi="新細明體" w:cs="新細明體" w:hint="eastAsia"/>
+                      <w:color w:val="000000"/>
+                      <w:sz w:val="24"/>
+                      <w:szCs w:val="24"/>
+                      <w:lang w:val="en-US"/>
+                    </w:rPr>
+                    <w:t>application.stage_rollback</w:t>
+                  </w:r>
+                  <w:proofErr w:type="spellEnd"/>
+                  <w:r>
+                    <w:rPr>
+                      <w:rFonts w:ascii="新細明體" w:eastAsia="新細明體" w:hAnsi="新細明體" w:cs="新細明體" w:hint="eastAsia"/>
+                      <w:color w:val="000000"/>
+                      <w:sz w:val="24"/>
+                      <w:szCs w:val="24"/>
+                      <w:lang w:val="en-US"/>
+                    </w:rPr>
+                    <w:t xml:space="preserve"> 退回申請階段</w:t>
+                  </w:r>
+                </w:p>
+              </w:tc>
+            </w:tr>
+            <w:tr>
+              <w:trPr>
+                <w:trHeight w:val="580"/>
+              </w:trPr>
+              <w:tc>
+                <w:tcPr>
+                  <w:tcW w:w="3963" w:type="dxa"/>
+                  <w:tcBorders>
+                    <w:top w:val="nil"/>
+                    <w:left w:val="nil"/>
+                    <w:bottom w:val="nil"/>
+                    <w:right w:val="nil"/>
+                  </w:tcBorders>
+                  <w:shd w:val="clear" w:color="auto" w:fill="auto"/>
+                  <w:noWrap/>
+                  <w:vAlign w:val="center"/>
+                  <w:hideMark/>
+                </w:tcPr>
+                <w:p>
+                  <w:pPr>
+                    <w:spacing w:line="240" w:lineRule="auto"/>
+                    <w:rPr>
+                      <w:rFonts w:ascii="新細明體" w:eastAsia="新細明體" w:hAnsi="新細明體" w:cs="新細明體" w:hint="eastAsia"/>
+                      <w:color w:val="000000"/>
+                      <w:sz w:val="24"/>
+                      <w:szCs w:val="24"/>
+                      <w:lang w:val="en-US"/>
+                    </w:rPr>
+                  </w:pPr>
+                  <w:proofErr w:type="spellStart"/>
+                  <w:r>
+                    <w:rPr>
+                      <w:rFonts w:ascii="新細明體" w:eastAsia="新細明體" w:hAnsi="新細明體" w:cs="新細明體" w:hint="eastAsia"/>
+                      <w:color w:val="000000"/>
+                      <w:sz w:val="24"/>
+                      <w:szCs w:val="24"/>
+                      <w:lang w:val="en-US"/>
+                    </w:rPr>
+                    <w:t>application.officer_assign</w:t>
+                  </w:r>
+                  <w:proofErr w:type="spellEnd"/>
+                  <w:r>
+                    <w:rPr>
+                      <w:rFonts w:ascii="新細明體" w:eastAsia="新細明體" w:hAnsi="新細明體" w:cs="新細明體" w:hint="eastAsia"/>
+                      <w:color w:val="000000"/>
+                      <w:sz w:val="24"/>
+                      <w:szCs w:val="24"/>
+                      <w:lang w:val="en-US"/>
+                    </w:rPr>
+                    <w:t xml:space="preserve"> </w:t>
+                  </w:r>
+                  <w:proofErr w:type="gramStart"/>
+                  <w:r>
+                    <w:rPr>
+                      <w:rFonts w:ascii="新細明體" w:eastAsia="新細明體" w:hAnsi="新細明體" w:cs="新細明體" w:hint="eastAsia"/>
+                      <w:color w:val="000000"/>
+                      <w:sz w:val="24"/>
+                      <w:szCs w:val="24"/>
+                      <w:lang w:val="en-US"/>
+                    </w:rPr>
+                    <w:t>派案</w:t>
+                  </w:r>
+                  <w:proofErr w:type="gramEnd"/>
+                </w:p>
+              </w:tc>
+            </w:tr>
+            <w:tr>
+              <w:trPr>
+                <w:trHeight w:val="390"/>
+              </w:trPr>
+              <w:tc>
+                <w:tcPr>
+                  <w:tcW w:w="3963" w:type="dxa"/>
+                  <w:tcBorders>
+                    <w:top w:val="nil"/>
+                    <w:left w:val="nil"/>
+                    <w:bottom w:val="nil"/>
+                    <w:right w:val="nil"/>
+                  </w:tcBorders>
+                  <w:shd w:val="clear" w:color="auto" w:fill="auto"/>
+                  <w:noWrap/>
+                  <w:vAlign w:val="center"/>
+                  <w:hideMark/>
+                </w:tcPr>
+                <w:p>
+                  <w:pPr>
+                    <w:spacing w:line="240" w:lineRule="auto"/>
+                    <w:rPr>
+                      <w:rFonts w:ascii="新細明體" w:eastAsia="新細明體" w:hAnsi="新細明體" w:cs="新細明體" w:hint="eastAsia"/>
+                      <w:color w:val="000000"/>
+                      <w:sz w:val="24"/>
+                      <w:szCs w:val="24"/>
+                      <w:lang w:val="en-US"/>
+                    </w:rPr>
+                  </w:pPr>
+                  <w:proofErr w:type="spellStart"/>
+                  <w:r>
+                    <w:rPr>
+                      <w:rFonts w:ascii="新細明體" w:eastAsia="新細明體" w:hAnsi="新細明體" w:cs="新細明體" w:hint="eastAsia"/>
+                      <w:color w:val="000000"/>
+                      <w:sz w:val="24"/>
+                      <w:szCs w:val="24"/>
+                      <w:lang w:val="en-US"/>
+                    </w:rPr>
+                    <w:t>application.close</w:t>
+                  </w:r>
+                  <w:proofErr w:type="spellEnd"/>
+                  <w:r>
+                    <w:rPr>
+                      <w:rFonts w:ascii="新細明體" w:eastAsia="新細明體" w:hAnsi="新細明體" w:cs="新細明體" w:hint="eastAsia"/>
+                      <w:color w:val="000000"/>
+                      <w:sz w:val="24"/>
+                      <w:szCs w:val="24"/>
+                      <w:lang w:val="en-US"/>
+                    </w:rPr>
+                    <w:t xml:space="preserve"> 結案</w:t>
+                  </w:r>
+                </w:p>
+              </w:tc>
+            </w:tr>
+            <w:tr>
+              <w:trPr>
+                <w:trHeight w:val="710"/>
+              </w:trPr>
+              <w:tc>
+                <w:tcPr>
+                  <w:tcW w:w="3963" w:type="dxa"/>
+                  <w:tcBorders>
+                    <w:top w:val="nil"/>
+                    <w:left w:val="nil"/>
+                    <w:bottom w:val="nil"/>
+                    <w:right w:val="nil"/>
+                  </w:tcBorders>
+                  <w:shd w:val="clear" w:color="auto" w:fill="auto"/>
+                  <w:noWrap/>
+                  <w:vAlign w:val="center"/>
+                  <w:hideMark/>
+                </w:tcPr>
+                <w:p>
+                  <w:pPr>
+                    <w:spacing w:line="240" w:lineRule="auto"/>
+                    <w:rPr>
+                      <w:rFonts w:ascii="新細明體" w:eastAsia="新細明體" w:hAnsi="新細明體" w:cs="新細明體" w:hint="eastAsia"/>
+                      <w:color w:val="000000"/>
+                      <w:sz w:val="24"/>
+                      <w:szCs w:val="24"/>
+                      <w:lang w:val="en-US"/>
+                    </w:rPr>
+                  </w:pPr>
+                  <w:proofErr w:type="spellStart"/>
+                  <w:r>
+                    <w:rPr>
+                      <w:rFonts w:ascii="新細明體" w:eastAsia="新細明體" w:hAnsi="新細明體" w:cs="新細明體" w:hint="eastAsia"/>
+                      <w:color w:val="000000"/>
+                      <w:sz w:val="24"/>
+                      <w:szCs w:val="24"/>
+                      <w:lang w:val="en-US"/>
+                    </w:rPr>
+                    <w:lastRenderedPageBreak/>
+                    <w:t>home_visit.create</w:t>
+                  </w:r>
+                  <w:proofErr w:type="spellEnd"/>
+                  <w:r>
+                    <w:rPr>
+                      <w:rFonts w:ascii="新細明體" w:eastAsia="新細明體" w:hAnsi="新細明體" w:cs="新細明體" w:hint="eastAsia"/>
+                      <w:color w:val="000000"/>
+                      <w:sz w:val="24"/>
+                      <w:szCs w:val="24"/>
+                      <w:lang w:val="en-US"/>
+                    </w:rPr>
+                    <w:t xml:space="preserve"> 新增家訪紀錄</w:t>
+                  </w:r>
+                </w:p>
+              </w:tc>
+            </w:tr>
+            <w:tr>
+              <w:trPr>
+                <w:trHeight w:val="710"/>
+              </w:trPr>
+              <w:tc>
+                <w:tcPr>
+                  <w:tcW w:w="3963" w:type="dxa"/>
+                  <w:tcBorders>
+                    <w:top w:val="nil"/>
+                    <w:left w:val="nil"/>
+                    <w:bottom w:val="nil"/>
+                    <w:right w:val="nil"/>
+                  </w:tcBorders>
+                  <w:shd w:val="clear" w:color="auto" w:fill="auto"/>
+                  <w:noWrap/>
+                  <w:vAlign w:val="center"/>
+                  <w:hideMark/>
+                </w:tcPr>
+                <w:p>
+                  <w:pPr>
+                    <w:spacing w:line="240" w:lineRule="auto"/>
+                    <w:rPr>
+                      <w:rFonts w:ascii="新細明體" w:eastAsia="新細明體" w:hAnsi="新細明體" w:cs="新細明體" w:hint="eastAsia"/>
+                      <w:color w:val="000000"/>
+                      <w:sz w:val="24"/>
+                      <w:szCs w:val="24"/>
+                      <w:lang w:val="en-US"/>
+                    </w:rPr>
+                  </w:pPr>
+                  <w:proofErr w:type="spellStart"/>
+                  <w:r>
+                    <w:rPr>
+                      <w:rFonts w:ascii="新細明體" w:eastAsia="新細明體" w:hAnsi="新細明體" w:cs="新細明體" w:hint="eastAsia"/>
+                      <w:color w:val="000000"/>
+                      <w:sz w:val="24"/>
+                      <w:szCs w:val="24"/>
+                      <w:lang w:val="en-US"/>
+                    </w:rPr>
+                    <w:t>home_visit.update</w:t>
+                  </w:r>
+                  <w:proofErr w:type="spellEnd"/>
+                  <w:r>
+                    <w:rPr>
+                      <w:rFonts w:ascii="新細明體" w:eastAsia="新細明體" w:hAnsi="新細明體" w:cs="新細明體" w:hint="eastAsia"/>
+                      <w:color w:val="000000"/>
+                      <w:sz w:val="24"/>
+                      <w:szCs w:val="24"/>
+                      <w:lang w:val="en-US"/>
+                    </w:rPr>
+                    <w:t xml:space="preserve"> 修改家訪紀錄</w:t>
+                  </w:r>
+                </w:p>
+              </w:tc>
+            </w:tr>
+            <w:tr>
+              <w:trPr>
+                <w:trHeight w:val="710"/>
+              </w:trPr>
+              <w:tc>
+                <w:tcPr>
+                  <w:tcW w:w="3963" w:type="dxa"/>
+                  <w:tcBorders>
+                    <w:top w:val="nil"/>
+                    <w:left w:val="nil"/>
+                    <w:bottom w:val="nil"/>
+                    <w:right w:val="nil"/>
+                  </w:tcBorders>
+                  <w:shd w:val="clear" w:color="auto" w:fill="auto"/>
+                  <w:noWrap/>
+                  <w:vAlign w:val="center"/>
+                  <w:hideMark/>
+                </w:tcPr>
+                <w:p>
+                  <w:pPr>
+                    <w:spacing w:line="240" w:lineRule="auto"/>
+                    <w:rPr>
+                      <w:rFonts w:ascii="新細明體" w:eastAsia="新細明體" w:hAnsi="新細明體" w:cs="新細明體" w:hint="eastAsia"/>
+                      <w:color w:val="000000"/>
+                      <w:sz w:val="24"/>
+                      <w:szCs w:val="24"/>
+                      <w:lang w:val="en-US"/>
+                    </w:rPr>
+                  </w:pPr>
+                  <w:proofErr w:type="spellStart"/>
+                  <w:r>
+                    <w:rPr>
+                      <w:rFonts w:ascii="新細明體" w:eastAsia="新細明體" w:hAnsi="新細明體" w:cs="新細明體" w:hint="eastAsia"/>
+                      <w:color w:val="000000"/>
+                      <w:sz w:val="24"/>
+                      <w:szCs w:val="24"/>
+                      <w:lang w:val="en-US"/>
+                    </w:rPr>
+                    <w:t>document.upload</w:t>
+                  </w:r>
+                  <w:proofErr w:type="spellEnd"/>
+                  <w:r>
+                    <w:rPr>
+                      <w:rFonts w:ascii="新細明體" w:eastAsia="新細明體" w:hAnsi="新細明體" w:cs="新細明體" w:hint="eastAsia"/>
+                      <w:color w:val="000000"/>
+                      <w:sz w:val="24"/>
+                      <w:szCs w:val="24"/>
+                      <w:lang w:val="en-US"/>
+                    </w:rPr>
+                    <w:t xml:space="preserve"> 上傳文件</w:t>
+                  </w:r>
+                </w:p>
+              </w:tc>
+            </w:tr>
+            <w:tr>
+              <w:trPr>
+                <w:trHeight w:val="710"/>
+              </w:trPr>
+              <w:tc>
+                <w:tcPr>
+                  <w:tcW w:w="3963" w:type="dxa"/>
+                  <w:tcBorders>
+                    <w:top w:val="nil"/>
+                    <w:left w:val="nil"/>
+                    <w:bottom w:val="nil"/>
+                    <w:right w:val="nil"/>
+                  </w:tcBorders>
+                  <w:shd w:val="clear" w:color="auto" w:fill="auto"/>
+                  <w:noWrap/>
+                  <w:vAlign w:val="center"/>
+                  <w:hideMark/>
+                </w:tcPr>
+                <w:p>
+                  <w:pPr>
+                    <w:spacing w:line="240" w:lineRule="auto"/>
+                    <w:rPr>
+                      <w:rFonts w:ascii="新細明體" w:eastAsia="新細明體" w:hAnsi="新細明體" w:cs="新細明體" w:hint="eastAsia"/>
+                      <w:color w:val="000000"/>
+                      <w:sz w:val="24"/>
+                      <w:szCs w:val="24"/>
+                      <w:lang w:val="en-US"/>
+                    </w:rPr>
+                  </w:pPr>
+                  <w:proofErr w:type="spellStart"/>
+                  <w:r>
+                    <w:rPr>
+                      <w:rFonts w:ascii="新細明體" w:eastAsia="新細明體" w:hAnsi="新細明體" w:cs="新細明體" w:hint="eastAsia"/>
+                      <w:color w:val="000000"/>
+                      <w:sz w:val="24"/>
+                      <w:szCs w:val="24"/>
+                      <w:lang w:val="en-US"/>
+                    </w:rPr>
+                    <w:t>document.preview</w:t>
+                  </w:r>
+                  <w:proofErr w:type="spellEnd"/>
+                  <w:r>
+                    <w:rPr>
+                      <w:rFonts w:ascii="新細明體" w:eastAsia="新細明體" w:hAnsi="新細明體" w:cs="新細明體" w:hint="eastAsia"/>
+                      <w:color w:val="000000"/>
+                      <w:sz w:val="24"/>
+                      <w:szCs w:val="24"/>
+                      <w:lang w:val="en-US"/>
+                    </w:rPr>
+                    <w:t xml:space="preserve"> 預覽文件</w:t>
+                  </w:r>
+                </w:p>
+              </w:tc>
+            </w:tr>
+            <w:tr>
+              <w:trPr>
+                <w:trHeight w:val="710"/>
+              </w:trPr>
+              <w:tc>
+                <w:tcPr>
+                  <w:tcW w:w="3963" w:type="dxa"/>
+                  <w:tcBorders>
+                    <w:top w:val="nil"/>
+                    <w:left w:val="nil"/>
+                    <w:bottom w:val="nil"/>
+                    <w:right w:val="nil"/>
+                  </w:tcBorders>
+                  <w:shd w:val="clear" w:color="auto" w:fill="auto"/>
+                  <w:noWrap/>
+                  <w:vAlign w:val="center"/>
+                  <w:hideMark/>
+                </w:tcPr>
+                <w:p>
+                  <w:pPr>
+                    <w:spacing w:line="240" w:lineRule="auto"/>
+                    <w:rPr>
+                      <w:rFonts w:ascii="新細明體" w:eastAsia="新細明體" w:hAnsi="新細明體" w:cs="新細明體" w:hint="eastAsia"/>
+                      <w:color w:val="000000"/>
+                      <w:sz w:val="24"/>
+                      <w:szCs w:val="24"/>
+                      <w:lang w:val="en-US"/>
+                    </w:rPr>
+                  </w:pPr>
+                  <w:proofErr w:type="spellStart"/>
+                  <w:r>
+                    <w:rPr>
+                      <w:rFonts w:ascii="新細明體" w:eastAsia="新細明體" w:hAnsi="新細明體" w:cs="新細明體" w:hint="eastAsia"/>
+                      <w:color w:val="000000"/>
+                      <w:sz w:val="24"/>
+                      <w:szCs w:val="24"/>
+                      <w:lang w:val="en-US"/>
+                    </w:rPr>
+                    <w:t>document.delete</w:t>
+                  </w:r>
+                  <w:proofErr w:type="spellEnd"/>
+                  <w:r>
+                    <w:rPr>
+                      <w:rFonts w:ascii="新細明體" w:eastAsia="新細明體" w:hAnsi="新細明體" w:cs="新細明體" w:hint="eastAsia"/>
+                      <w:color w:val="000000"/>
+                      <w:sz w:val="24"/>
+                      <w:szCs w:val="24"/>
+                      <w:lang w:val="en-US"/>
+                    </w:rPr>
+                    <w:t xml:space="preserve"> 刪除文件</w:t>
+                  </w:r>
+                </w:p>
+              </w:tc>
+            </w:tr>
+            <w:tr>
+              <w:trPr>
+                <w:trHeight w:val="710"/>
+              </w:trPr>
+              <w:tc>
+                <w:tcPr>
+                  <w:tcW w:w="3963" w:type="dxa"/>
+                  <w:tcBorders>
+                    <w:top w:val="nil"/>
+                    <w:left w:val="nil"/>
+                    <w:bottom w:val="nil"/>
+                    <w:right w:val="nil"/>
+                  </w:tcBorders>
+                  <w:shd w:val="clear" w:color="auto" w:fill="auto"/>
+                  <w:noWrap/>
+                  <w:vAlign w:val="center"/>
+                  <w:hideMark/>
+                </w:tcPr>
+                <w:p>
+                  <w:pPr>
+                    <w:spacing w:line="240" w:lineRule="auto"/>
+                    <w:rPr>
+                      <w:rFonts w:ascii="新細明體" w:eastAsia="新細明體" w:hAnsi="新細明體" w:cs="新細明體" w:hint="eastAsia"/>
+                      <w:color w:val="000000"/>
+                      <w:sz w:val="24"/>
+                      <w:szCs w:val="24"/>
+                      <w:lang w:val="en-US"/>
+                    </w:rPr>
+                  </w:pPr>
+                  <w:proofErr w:type="spellStart"/>
+                  <w:r>
+                    <w:rPr>
+                      <w:rFonts w:ascii="新細明體" w:eastAsia="新細明體" w:hAnsi="新細明體" w:cs="新細明體" w:hint="eastAsia"/>
+                      <w:color w:val="000000"/>
+                      <w:sz w:val="24"/>
+                      <w:szCs w:val="24"/>
+                      <w:lang w:val="en-US"/>
+                    </w:rPr>
+                    <w:t>document.status_update</w:t>
+                  </w:r>
+                  <w:proofErr w:type="spellEnd"/>
+                  <w:r>
+                    <w:rPr>
+                      <w:rFonts w:ascii="新細明體" w:eastAsia="新細明體" w:hAnsi="新細明體" w:cs="新細明體" w:hint="eastAsia"/>
+                      <w:color w:val="000000"/>
+                      <w:sz w:val="24"/>
+                      <w:szCs w:val="24"/>
+                      <w:lang w:val="en-US"/>
+                    </w:rPr>
+                    <w:t xml:space="preserve"> 審核文件狀態</w:t>
+                  </w:r>
+                </w:p>
+              </w:tc>
+            </w:tr>
+            <w:tr>
+              <w:trPr>
+                <w:trHeight w:val="710"/>
+              </w:trPr>
+              <w:tc>
+                <w:tcPr>
+                  <w:tcW w:w="3963" w:type="dxa"/>
+                  <w:tcBorders>
+                    <w:top w:val="nil"/>
+                    <w:left w:val="nil"/>
+                    <w:bottom w:val="nil"/>
+                    <w:right w:val="nil"/>
+                  </w:tcBorders>
+                  <w:shd w:val="clear" w:color="auto" w:fill="auto"/>
+                  <w:noWrap/>
+                  <w:vAlign w:val="center"/>
+                  <w:hideMark/>
+                </w:tcPr>
+                <w:p>
+                  <w:pPr>
+                    <w:spacing w:line="240" w:lineRule="auto"/>
+                    <w:rPr>
+                      <w:rFonts w:ascii="新細明體" w:eastAsia="新細明體" w:hAnsi="新細明體" w:cs="新細明體" w:hint="eastAsia"/>
+                      <w:color w:val="000000"/>
+                      <w:sz w:val="24"/>
+                      <w:szCs w:val="24"/>
+                      <w:lang w:val="en-US"/>
+                    </w:rPr>
+                  </w:pPr>
+                  <w:proofErr w:type="spellStart"/>
+                  <w:r>
+                    <w:rPr>
+                      <w:rFonts w:ascii="新細明體" w:eastAsia="新細明體" w:hAnsi="新細明體" w:cs="新細明體" w:hint="eastAsia"/>
+                      <w:color w:val="000000"/>
+                      <w:sz w:val="24"/>
+                      <w:szCs w:val="24"/>
+                      <w:lang w:val="en-US"/>
+                    </w:rPr>
+                    <w:t>user.login</w:t>
+                  </w:r>
+                  <w:proofErr w:type="spellEnd"/>
+                  <w:r>
+                    <w:rPr>
+                      <w:rFonts w:ascii="新細明體" w:eastAsia="新細明體" w:hAnsi="新細明體" w:cs="新細明體" w:hint="eastAsia"/>
+                      <w:color w:val="000000"/>
+                      <w:sz w:val="24"/>
+                      <w:szCs w:val="24"/>
+                      <w:lang w:val="en-US"/>
+                    </w:rPr>
+                    <w:t xml:space="preserve"> 使用者登入</w:t>
+                  </w:r>
+                </w:p>
+              </w:tc>
+            </w:tr>
+            <w:tr>
+              <w:trPr>
+                <w:trHeight w:val="710"/>
+              </w:trPr>
+              <w:tc>
+                <w:tcPr>
+                  <w:tcW w:w="3963" w:type="dxa"/>
+                  <w:tcBorders>
+                    <w:top w:val="nil"/>
+                    <w:left w:val="nil"/>
+                    <w:bottom w:val="nil"/>
+                    <w:right w:val="nil"/>
+                  </w:tcBorders>
+                  <w:shd w:val="clear" w:color="auto" w:fill="auto"/>
+                  <w:noWrap/>
+                  <w:vAlign w:val="center"/>
+                  <w:hideMark/>
+                </w:tcPr>
+                <w:p>
+                  <w:pPr>
+                    <w:spacing w:line="240" w:lineRule="auto"/>
+                    <w:rPr>
+                      <w:rFonts w:ascii="新細明體" w:eastAsia="新細明體" w:hAnsi="新細明體" w:cs="新細明體" w:hint="eastAsia"/>
+                      <w:color w:val="000000"/>
+                      <w:sz w:val="24"/>
+                      <w:szCs w:val="24"/>
+                      <w:lang w:val="en-US"/>
+                    </w:rPr>
+                  </w:pPr>
+                  <w:proofErr w:type="spellStart"/>
+                  <w:r>
+                    <w:rPr>
+                      <w:rFonts w:ascii="新細明體" w:eastAsia="新細明體" w:hAnsi="新細明體" w:cs="新細明體" w:hint="eastAsia"/>
+                      <w:color w:val="000000"/>
+                      <w:sz w:val="24"/>
+                      <w:szCs w:val="24"/>
+                      <w:lang w:val="en-US"/>
+                    </w:rPr>
+                    <w:t>user.create</w:t>
+                  </w:r>
+                  <w:proofErr w:type="spellEnd"/>
+                  <w:r>
+                    <w:rPr>
+                      <w:rFonts w:ascii="新細明體" w:eastAsia="新細明體" w:hAnsi="新細明體" w:cs="新細明體" w:hint="eastAsia"/>
+                      <w:color w:val="000000"/>
+                      <w:sz w:val="24"/>
+                      <w:szCs w:val="24"/>
+                      <w:lang w:val="en-US"/>
+                    </w:rPr>
+                    <w:t xml:space="preserve"> 新增使用者</w:t>
+                  </w:r>
+                </w:p>
+              </w:tc>
+            </w:tr>
+            <w:tr>
+              <w:trPr>
+                <w:trHeight w:val="710"/>
+              </w:trPr>
+              <w:tc>
+                <w:tcPr>
+                  <w:tcW w:w="3963" w:type="dxa"/>
+                  <w:tcBorders>
+                    <w:top w:val="nil"/>
+                    <w:left w:val="nil"/>
+                    <w:bottom w:val="nil"/>
+                    <w:right w:val="nil"/>
+                  </w:tcBorders>
+                  <w:shd w:val="clear" w:color="auto" w:fill="auto"/>
+                  <w:noWrap/>
+                  <w:vAlign w:val="center"/>
+                  <w:hideMark/>
+                </w:tcPr>
+                <w:p>
+                  <w:pPr>
+                    <w:spacing w:line="240" w:lineRule="auto"/>
+                    <w:rPr>
+                      <w:rFonts w:ascii="新細明體" w:eastAsia="新細明體" w:hAnsi="新細明體" w:cs="新細明體" w:hint="eastAsia"/>
+                      <w:color w:val="000000"/>
+                      <w:sz w:val="24"/>
+                      <w:szCs w:val="24"/>
+                      <w:lang w:val="en-US"/>
+                    </w:rPr>
+                  </w:pPr>
+                  <w:proofErr w:type="spellStart"/>
+                  <w:r>
+                    <w:rPr>
+                      <w:rFonts w:ascii="新細明體" w:eastAsia="新細明體" w:hAnsi="新細明體" w:cs="新細明體" w:hint="eastAsia"/>
+                      <w:color w:val="000000"/>
+                      <w:sz w:val="24"/>
+                      <w:szCs w:val="24"/>
+                      <w:lang w:val="en-US"/>
+                    </w:rPr>
+                    <w:t>user.update</w:t>
+                  </w:r>
+                  <w:proofErr w:type="spellEnd"/>
+                  <w:r>
+                    <w:rPr>
+                      <w:rFonts w:ascii="新細明體" w:eastAsia="新細明體" w:hAnsi="新細明體" w:cs="新細明體" w:hint="eastAsia"/>
+                      <w:color w:val="000000"/>
+                      <w:sz w:val="24"/>
+                      <w:szCs w:val="24"/>
+                      <w:lang w:val="en-US"/>
+                    </w:rPr>
+                    <w:t xml:space="preserve"> 修改使用者</w:t>
+                  </w:r>
+                </w:p>
+              </w:tc>
+            </w:tr>
+            <w:tr>
+              <w:trPr>
+                <w:trHeight w:val="710"/>
+              </w:trPr>
+              <w:tc>
+                <w:tcPr>
+                  <w:tcW w:w="3963" w:type="dxa"/>
+                  <w:tcBorders>
+                    <w:top w:val="nil"/>
+                    <w:left w:val="nil"/>
+                    <w:bottom w:val="nil"/>
+                    <w:right w:val="nil"/>
+                  </w:tcBorders>
+                  <w:shd w:val="clear" w:color="auto" w:fill="auto"/>
+                  <w:noWrap/>
+                  <w:vAlign w:val="center"/>
+                  <w:hideMark/>
+                </w:tcPr>
+                <w:p>
+                  <w:pPr>
+                    <w:spacing w:line="240" w:lineRule="auto"/>
+                    <w:rPr>
+                      <w:rFonts w:ascii="新細明體" w:eastAsia="新細明體" w:hAnsi="新細明體" w:cs="新細明體" w:hint="eastAsia"/>
+                      <w:color w:val="000000"/>
+                      <w:sz w:val="24"/>
+                      <w:szCs w:val="24"/>
+                      <w:lang w:val="en-US"/>
+                    </w:rPr>
+                  </w:pPr>
+                  <w:proofErr w:type="spellStart"/>
+                  <w:r>
+                    <w:rPr>
+                      <w:rFonts w:ascii="新細明體" w:eastAsia="新細明體" w:hAnsi="新細明體" w:cs="新細明體" w:hint="eastAsia"/>
+                      <w:color w:val="000000"/>
+                      <w:sz w:val="24"/>
+                      <w:szCs w:val="24"/>
+                      <w:lang w:val="en-US"/>
+                    </w:rPr>
+                    <w:t>user.deactivate</w:t>
+                  </w:r>
+                  <w:proofErr w:type="spellEnd"/>
+                  <w:r>
+                    <w:rPr>
+                      <w:rFonts w:ascii="新細明體" w:eastAsia="新細明體" w:hAnsi="新細明體" w:cs="新細明體" w:hint="eastAsia"/>
+                      <w:color w:val="000000"/>
+                      <w:sz w:val="24"/>
+                      <w:szCs w:val="24"/>
+                      <w:lang w:val="en-US"/>
+                    </w:rPr>
+                    <w:t xml:space="preserve"> 停用使用者</w:t>
+                  </w:r>
+                </w:p>
+              </w:tc>
+            </w:tr>
+            <w:tr>
+              <w:trPr>
+                <w:trHeight w:val="710"/>
+              </w:trPr>
+              <w:tc>
+                <w:tcPr>
+                  <w:tcW w:w="3963" w:type="dxa"/>
+                  <w:tcBorders>
+                    <w:top w:val="nil"/>
+                    <w:left w:val="nil"/>
+                    <w:bottom w:val="nil"/>
+                    <w:right w:val="nil"/>
+                  </w:tcBorders>
+                  <w:shd w:val="clear" w:color="auto" w:fill="auto"/>
+                  <w:noWrap/>
+                  <w:vAlign w:val="center"/>
+                  <w:hideMark/>
+                </w:tcPr>
+                <w:p>
+                  <w:pPr>
+                    <w:spacing w:line="240" w:lineRule="auto"/>
+                    <w:rPr>
+                      <w:rFonts w:ascii="新細明體" w:eastAsia="新細明體" w:hAnsi="新細明體" w:cs="新細明體" w:hint="eastAsia"/>
+                      <w:color w:val="000000"/>
+                      <w:sz w:val="24"/>
+                      <w:szCs w:val="24"/>
+                      <w:lang w:val="en-US"/>
+                    </w:rPr>
+                  </w:pPr>
+                  <w:proofErr w:type="spellStart"/>
+                  <w:r>
+                    <w:rPr>
+                      <w:rFonts w:ascii="新細明體" w:eastAsia="新細明體" w:hAnsi="新細明體" w:cs="新細明體" w:hint="eastAsia"/>
+                      <w:color w:val="000000"/>
+                      <w:sz w:val="24"/>
+                      <w:szCs w:val="24"/>
+                      <w:lang w:val="en-US"/>
+                    </w:rPr>
+                    <w:t>file_location.create</w:t>
+                  </w:r>
+                  <w:proofErr w:type="spellEnd"/>
+                  <w:r>
+                    <w:rPr>
+                      <w:rFonts w:ascii="新細明體" w:eastAsia="新細明體" w:hAnsi="新細明體" w:cs="新細明體" w:hint="eastAsia"/>
+                      <w:color w:val="000000"/>
+                      <w:sz w:val="24"/>
+                      <w:szCs w:val="24"/>
+                      <w:lang w:val="en-US"/>
+                    </w:rPr>
+                    <w:t xml:space="preserve"> 新增實體位置</w:t>
+                  </w:r>
+                </w:p>
+              </w:tc>
+            </w:tr>
+            <w:tr>
+              <w:trPr>
+                <w:trHeight w:val="710"/>
+              </w:trPr>
+              <w:tc>
+                <w:tcPr>
+                  <w:tcW w:w="3963" w:type="dxa"/>
+                  <w:tcBorders>
+                    <w:top w:val="nil"/>
+                    <w:left w:val="nil"/>
+                    <w:bottom w:val="nil"/>
+                    <w:right w:val="nil"/>
+                  </w:tcBorders>
+                  <w:shd w:val="clear" w:color="auto" w:fill="auto"/>
+                  <w:noWrap/>
+                  <w:vAlign w:val="center"/>
+                  <w:hideMark/>
+                </w:tcPr>
+                <w:p>
+                  <w:pPr>
+                    <w:spacing w:line="240" w:lineRule="auto"/>
+                    <w:rPr>
+                      <w:rFonts w:ascii="新細明體" w:eastAsia="新細明體" w:hAnsi="新細明體" w:cs="新細明體" w:hint="eastAsia"/>
+                      <w:color w:val="000000"/>
+                      <w:sz w:val="24"/>
+                      <w:szCs w:val="24"/>
+                      <w:lang w:val="en-US"/>
+                    </w:rPr>
+                  </w:pPr>
+                  <w:proofErr w:type="spellStart"/>
+                  <w:r>
+                    <w:rPr>
+                      <w:rFonts w:ascii="新細明體" w:eastAsia="新細明體" w:hAnsi="新細明體" w:cs="新細明體" w:hint="eastAsia"/>
+                      <w:color w:val="000000"/>
+                      <w:sz w:val="24"/>
+                      <w:szCs w:val="24"/>
+                      <w:lang w:val="en-US"/>
+                    </w:rPr>
+                    <w:t>file_location.update</w:t>
+                  </w:r>
+                  <w:proofErr w:type="spellEnd"/>
+                  <w:r>
+                    <w:rPr>
+                      <w:rFonts w:ascii="新細明體" w:eastAsia="新細明體" w:hAnsi="新細明體" w:cs="新細明體" w:hint="eastAsia"/>
+                      <w:color w:val="000000"/>
+                      <w:sz w:val="24"/>
+                      <w:szCs w:val="24"/>
+                      <w:lang w:val="en-US"/>
+                    </w:rPr>
+                    <w:t xml:space="preserve"> 修改實體位置</w:t>
+                  </w:r>
+                </w:p>
+              </w:tc>
+            </w:tr>
+            <w:tr>
+              <w:trPr>
+                <w:trHeight w:val="710"/>
+              </w:trPr>
+              <w:tc>
+                <w:tcPr>
+                  <w:tcW w:w="3963" w:type="dxa"/>
+                  <w:tcBorders>
+                    <w:top w:val="nil"/>
+                    <w:left w:val="nil"/>
+                    <w:bottom w:val="nil"/>
+                    <w:right w:val="nil"/>
+                  </w:tcBorders>
+                  <w:shd w:val="clear" w:color="auto" w:fill="auto"/>
+                  <w:noWrap/>
+                  <w:vAlign w:val="center"/>
+                  <w:hideMark/>
+                </w:tcPr>
+                <w:p>
+                  <w:pPr>
+                    <w:spacing w:line="240" w:lineRule="auto"/>
+                    <w:rPr>
+                      <w:rFonts w:ascii="新細明體" w:eastAsia="新細明體" w:hAnsi="新細明體" w:cs="新細明體" w:hint="eastAsia"/>
+                      <w:color w:val="000000"/>
+                      <w:sz w:val="24"/>
+                      <w:szCs w:val="24"/>
+                      <w:lang w:val="en-US"/>
+                    </w:rPr>
+                  </w:pPr>
+                  <w:proofErr w:type="spellStart"/>
+                  <w:r>
+                    <w:rPr>
+                      <w:rFonts w:ascii="新細明體" w:eastAsia="新細明體" w:hAnsi="新細明體" w:cs="新細明體" w:hint="eastAsia"/>
+                      <w:color w:val="000000"/>
+                      <w:sz w:val="24"/>
+                      <w:szCs w:val="24"/>
+                      <w:lang w:val="en-US"/>
+                    </w:rPr>
+                    <w:t>file_location.disable</w:t>
+                  </w:r>
+                  <w:proofErr w:type="spellEnd"/>
+                  <w:r>
+                    <w:rPr>
+                      <w:rFonts w:ascii="新細明體" w:eastAsia="新細明體" w:hAnsi="新細明體" w:cs="新細明體" w:hint="eastAsia"/>
+                      <w:color w:val="000000"/>
+                      <w:sz w:val="24"/>
+                      <w:szCs w:val="24"/>
+                      <w:lang w:val="en-US"/>
+                    </w:rPr>
+                    <w:t xml:space="preserve"> 停用實體位置</w:t>
+                  </w:r>
+                </w:p>
+              </w:tc>
+            </w:tr>
+            <w:tr>
+              <w:trPr>
+                <w:trHeight w:val="710"/>
+              </w:trPr>
+              <w:tc>
+                <w:tcPr>
+                  <w:tcW w:w="3963" w:type="dxa"/>
+                  <w:tcBorders>
+                    <w:top w:val="nil"/>
+                    <w:left w:val="nil"/>
+                    <w:bottom w:val="nil"/>
+                    <w:right w:val="nil"/>
+                  </w:tcBorders>
+                  <w:shd w:val="clear" w:color="auto" w:fill="auto"/>
+                  <w:noWrap/>
+                  <w:vAlign w:val="center"/>
+                  <w:hideMark/>
+                </w:tcPr>
+                <w:p>
+                  <w:pPr>
+                    <w:spacing w:line="240" w:lineRule="auto"/>
+                    <w:rPr>
+                      <w:rFonts w:ascii="新細明體" w:eastAsia="新細明體" w:hAnsi="新細明體" w:cs="新細明體" w:hint="eastAsia"/>
+                      <w:color w:val="000000"/>
+                      <w:sz w:val="24"/>
+                      <w:szCs w:val="24"/>
+                      <w:lang w:val="en-US"/>
+                    </w:rPr>
+                  </w:pPr>
+                  <w:proofErr w:type="spellStart"/>
+                  <w:r>
+                    <w:rPr>
+                      <w:rFonts w:ascii="新細明體" w:eastAsia="新細明體" w:hAnsi="新細明體" w:cs="新細明體" w:hint="eastAsia"/>
+                      <w:color w:val="000000"/>
+                      <w:sz w:val="24"/>
+                      <w:szCs w:val="24"/>
+                      <w:lang w:val="en-US"/>
+                    </w:rPr>
+                    <w:t>file_location.enable</w:t>
+                  </w:r>
+                  <w:proofErr w:type="spellEnd"/>
+                  <w:r>
+                    <w:rPr>
+                      <w:rFonts w:ascii="新細明體" w:eastAsia="新細明體" w:hAnsi="新細明體" w:cs="新細明體" w:hint="eastAsia"/>
+                      <w:color w:val="000000"/>
+                      <w:sz w:val="24"/>
+                      <w:szCs w:val="24"/>
+                      <w:lang w:val="en-US"/>
+                    </w:rPr>
+                    <w:t xml:space="preserve"> 啟用實體位置</w:t>
+                  </w:r>
+                </w:p>
+              </w:tc>
+            </w:tr>
+          </w:tbl>
+          <w:p>
+            <w:pPr>
+              <w:rPr>
+                <w:rFonts w:ascii="Verdana" w:eastAsia="Verdana" w:hAnsi="Verdana" w:cs="Verdana"/>
+                <w:sz w:val="24"/>
+                <w:szCs w:val="24"/>
+                <w:lang w:val="en-US"/>
+              </w:rPr>
+            </w:pPr>
+          </w:p>
+        </w:tc>
+      </w:tr>
+      <w:tr>
+        <w:tc>
+          <w:tcPr>
+            <w:tcW w:w="2254" w:type="dxa"/>
+          </w:tcPr>
+          <w:p>
+            <w:pPr>
+              <w:rPr>
+                <w:rFonts w:ascii="Verdana" w:hAnsi="Verdana" w:cs="Verdana"/>
+                <w:sz w:val="24"/>
+                <w:szCs w:val="24"/>
+                <w:lang w:val="en-US"/>
+              </w:rPr>
+            </w:pPr>
+            <w:r>
+              <w:lastRenderedPageBreak/>
+              <w:t>target_type</w:t>
+            </w:r>
+          </w:p>
+        </w:tc>
+        <w:tc>
+          <w:tcPr>
+            <w:tcW w:w="2255" w:type="dxa"/>
+            <w:vAlign w:val="center"/>
+          </w:tcPr>
+          <w:p>
+            <w:pPr>
+              <w:rPr>
+                <w:rFonts w:ascii="Verdana" w:eastAsia="Verdana" w:hAnsi="Verdana" w:cs="Verdana"/>
+                <w:sz w:val="24"/>
+                <w:szCs w:val="24"/>
+                <w:lang w:val="en-US"/>
+              </w:rPr>
+            </w:pPr>
+            <w:r>
+              <w:rPr>
+                <w:rFonts w:ascii="Segoe UI" w:hAnsi="Segoe UI" w:cs="Segoe UI"/>
+                <w:color w:val="1F2328"/>
+                <w:sz w:val="16"/>
+                <w:szCs w:val="16"/>
+              </w:rPr>
+              <w:t>目標類型</w:t>
+            </w:r>
+          </w:p>
+        </w:tc>
+        <w:tc>
+          <w:tcPr>
+            <w:tcW w:w="2255" w:type="dxa"/>
+          </w:tcPr>
+          <w:p>
+            <w:pPr>
+              <w:rPr>
+                <w:rFonts w:ascii="Verdana" w:hAnsi="Verdana" w:cs="Verdana" w:hint="eastAsia"/>
+                <w:sz w:val="24"/>
+                <w:szCs w:val="24"/>
+                <w:lang w:val="en-US"/>
+              </w:rPr>
+            </w:pPr>
+            <w:r>
+              <w:t>varchar</w:t>
+            </w:r>
+          </w:p>
+        </w:tc>
+        <w:tc>
+          <w:tcPr>
+            <w:tcW w:w="2255" w:type="dxa"/>
+          </w:tcPr>
+          <w:tbl>
+            <w:tblPr>
+              <w:tblW w:w="3400" w:type="dxa"/>
+              <w:tblCellMar>
+                <w:left w:w="28" w:type="dxa"/>
+                <w:right w:w="28" w:type="dxa"/>
+              </w:tblCellMar>
+              <w:tblLook w:val="04A0" w:firstRow="1" w:lastRow="0" w:firstColumn="1" w:lastColumn="0" w:noHBand="0" w:noVBand="1"/>
+            </w:tblPr>
+            <w:tblGrid>
+              <w:gridCol w:w="3400"/>
+            </w:tblGrid>
+            <w:tr>
+              <w:trPr>
+                <w:trHeight w:val="710"/>
+              </w:trPr>
+              <w:tc>
+                <w:tcPr>
+                  <w:tcW w:w="3400" w:type="dxa"/>
+                  <w:tcBorders>
+                    <w:top w:val="nil"/>
+                    <w:left w:val="nil"/>
+                    <w:bottom w:val="nil"/>
+                    <w:right w:val="nil"/>
+                  </w:tcBorders>
+                  <w:shd w:val="clear" w:color="auto" w:fill="auto"/>
+                  <w:noWrap/>
+                  <w:vAlign w:val="center"/>
+                  <w:hideMark/>
+                </w:tcPr>
+                <w:p>
+                  <w:pPr>
+                    <w:spacing w:line="240" w:lineRule="auto"/>
+                    <w:rPr>
+                      <w:rFonts w:ascii="新細明體" w:eastAsia="新細明體" w:hAnsi="新細明體" w:cs="新細明體"/>
+                      <w:color w:val="000000"/>
+                      <w:sz w:val="24"/>
+                      <w:szCs w:val="24"/>
+                      <w:lang w:val="en-US"/>
+                    </w:rPr>
+                  </w:pPr>
+                  <w:r>
+                    <w:rPr>
+                      <w:rFonts w:ascii="新細明體" w:eastAsia="新細明體" w:hAnsi="新細明體" w:cs="新細明體" w:hint="eastAsia"/>
+                      <w:color w:val="000000"/>
+                      <w:sz w:val="24"/>
+                      <w:szCs w:val="24"/>
+                      <w:lang w:val="en-US"/>
+                    </w:rPr>
+                    <w:t>application 申請案件</w:t>
+                  </w:r>
+                </w:p>
+              </w:tc>
+            </w:tr>
+            <w:tr>
+              <w:trPr>
+                <w:trHeight w:val="710"/>
+              </w:trPr>
+              <w:tc>
+                <w:tcPr>
+                  <w:tcW w:w="3400" w:type="dxa"/>
+                  <w:tcBorders>
+                    <w:top w:val="nil"/>
+                    <w:left w:val="nil"/>
+                    <w:bottom w:val="nil"/>
+                    <w:right w:val="nil"/>
+                  </w:tcBorders>
+                  <w:shd w:val="clear" w:color="auto" w:fill="auto"/>
+                  <w:noWrap/>
+                  <w:vAlign w:val="center"/>
+                  <w:hideMark/>
+                </w:tcPr>
+                <w:p>
+                  <w:pPr>
+                    <w:spacing w:line="240" w:lineRule="auto"/>
+                    <w:rPr>
+                      <w:rFonts w:ascii="新細明體" w:eastAsia="新細明體" w:hAnsi="新細明體" w:cs="新細明體" w:hint="eastAsia"/>
+                      <w:color w:val="000000"/>
+                      <w:sz w:val="24"/>
+                      <w:szCs w:val="24"/>
+                      <w:lang w:val="en-US"/>
+                    </w:rPr>
+                  </w:pPr>
+                  <w:proofErr w:type="spellStart"/>
+                  <w:r>
+                    <w:rPr>
+                      <w:rFonts w:ascii="新細明體" w:eastAsia="新細明體" w:hAnsi="新細明體" w:cs="新細明體" w:hint="eastAsia"/>
+                      <w:color w:val="000000"/>
+                      <w:sz w:val="24"/>
+                      <w:szCs w:val="24"/>
+                      <w:lang w:val="en-US"/>
+                    </w:rPr>
+                    <w:t>home_visit</w:t>
+                  </w:r>
+                  <w:proofErr w:type="spellEnd"/>
+                  <w:r>
+                    <w:rPr>
+                      <w:rFonts w:ascii="新細明體" w:eastAsia="新細明體" w:hAnsi="新細明體" w:cs="新細明體" w:hint="eastAsia"/>
+                      <w:color w:val="000000"/>
+                      <w:sz w:val="24"/>
+                      <w:szCs w:val="24"/>
+                      <w:lang w:val="en-US"/>
+                    </w:rPr>
+                    <w:t xml:space="preserve"> 家訪紀錄</w:t>
+                  </w:r>
+                </w:p>
+              </w:tc>
+            </w:tr>
+            <w:tr>
+              <w:trPr>
+                <w:trHeight w:val="360"/>
+              </w:trPr>
+              <w:tc>
+                <w:tcPr>
+                  <w:tcW w:w="3400" w:type="dxa"/>
+                  <w:tcBorders>
+                    <w:top w:val="nil"/>
+                    <w:left w:val="nil"/>
+                    <w:bottom w:val="nil"/>
+                    <w:right w:val="nil"/>
+                  </w:tcBorders>
+                  <w:shd w:val="clear" w:color="auto" w:fill="auto"/>
+                  <w:noWrap/>
+                  <w:vAlign w:val="center"/>
+                  <w:hideMark/>
+                </w:tcPr>
+                <w:p>
+                  <w:pPr>
+                    <w:spacing w:line="240" w:lineRule="auto"/>
+                    <w:rPr>
+                      <w:rFonts w:ascii="新細明體" w:eastAsia="新細明體" w:hAnsi="新細明體" w:cs="新細明體" w:hint="eastAsia"/>
+                      <w:color w:val="000000"/>
+                      <w:sz w:val="24"/>
+                      <w:szCs w:val="24"/>
+                      <w:lang w:val="en-US"/>
+                    </w:rPr>
+                  </w:pPr>
+                  <w:r>
+                    <w:rPr>
+                      <w:rFonts w:ascii="新細明體" w:eastAsia="新細明體" w:hAnsi="新細明體" w:cs="新細明體" w:hint="eastAsia"/>
+                      <w:color w:val="000000"/>
+                      <w:sz w:val="24"/>
+                      <w:szCs w:val="24"/>
+                      <w:lang w:val="en-US"/>
+                    </w:rPr>
+                    <w:t>document 文件</w:t>
+                  </w:r>
+                </w:p>
+              </w:tc>
+            </w:tr>
+            <w:tr>
+              <w:trPr>
+                <w:trHeight w:val="360"/>
+              </w:trPr>
+              <w:tc>
+                <w:tcPr>
+                  <w:tcW w:w="3400" w:type="dxa"/>
+                  <w:tcBorders>
+                    <w:top w:val="nil"/>
+                    <w:left w:val="nil"/>
+                    <w:bottom w:val="nil"/>
+                    <w:right w:val="nil"/>
+                  </w:tcBorders>
+                  <w:shd w:val="clear" w:color="auto" w:fill="auto"/>
+                  <w:noWrap/>
+                  <w:vAlign w:val="center"/>
+                  <w:hideMark/>
+                </w:tcPr>
+                <w:p>
+                  <w:pPr>
+                    <w:spacing w:line="240" w:lineRule="auto"/>
+                    <w:rPr>
+                      <w:rFonts w:ascii="新細明體" w:eastAsia="新細明體" w:hAnsi="新細明體" w:cs="新細明體" w:hint="eastAsia"/>
+                      <w:color w:val="000000"/>
+                      <w:sz w:val="24"/>
+                      <w:szCs w:val="24"/>
+                      <w:lang w:val="en-US"/>
+                    </w:rPr>
+                  </w:pPr>
+                  <w:r>
+                    <w:rPr>
+                      <w:rFonts w:ascii="新細明體" w:eastAsia="新細明體" w:hAnsi="新細明體" w:cs="新細明體" w:hint="eastAsia"/>
+                      <w:color w:val="000000"/>
+                      <w:sz w:val="24"/>
+                      <w:szCs w:val="24"/>
+                      <w:lang w:val="en-US"/>
+                    </w:rPr>
+                    <w:t>user 使用者</w:t>
+                  </w:r>
+                </w:p>
+              </w:tc>
+            </w:tr>
+            <w:tr>
+              <w:trPr>
+                <w:trHeight w:val="710"/>
+              </w:trPr>
+              <w:tc>
+                <w:tcPr>
+                  <w:tcW w:w="3400" w:type="dxa"/>
+                  <w:tcBorders>
+                    <w:top w:val="nil"/>
+                    <w:left w:val="nil"/>
+                    <w:bottom w:val="nil"/>
+                    <w:right w:val="nil"/>
+                  </w:tcBorders>
+                  <w:shd w:val="clear" w:color="auto" w:fill="auto"/>
+                  <w:noWrap/>
+                  <w:vAlign w:val="center"/>
+                  <w:hideMark/>
+                </w:tcPr>
+                <w:p>
+                  <w:pPr>
+                    <w:spacing w:line="240" w:lineRule="auto"/>
+                    <w:rPr>
+                      <w:rFonts w:ascii="新細明體" w:eastAsia="新細明體" w:hAnsi="新細明體" w:cs="新細明體" w:hint="eastAsia"/>
+                      <w:color w:val="000000"/>
+                      <w:sz w:val="24"/>
+                      <w:szCs w:val="24"/>
+                      <w:lang w:val="en-US"/>
+                    </w:rPr>
+                  </w:pPr>
+                  <w:proofErr w:type="spellStart"/>
+                  <w:r>
+                    <w:rPr>
+                      <w:rFonts w:ascii="新細明體" w:eastAsia="新細明體" w:hAnsi="新細明體" w:cs="新細明體" w:hint="eastAsia"/>
+                      <w:color w:val="000000"/>
+                      <w:sz w:val="24"/>
+                      <w:szCs w:val="24"/>
+                      <w:lang w:val="en-US"/>
+                    </w:rPr>
+                    <w:t>file_location</w:t>
+                  </w:r>
+                  <w:proofErr w:type="spellEnd"/>
+                  <w:r>
+                    <w:rPr>
+                      <w:rFonts w:ascii="新細明體" w:eastAsia="新細明體" w:hAnsi="新細明體" w:cs="新細明體" w:hint="eastAsia"/>
+                      <w:color w:val="000000"/>
+                      <w:sz w:val="24"/>
+                      <w:szCs w:val="24"/>
+                      <w:lang w:val="en-US"/>
+                    </w:rPr>
+                    <w:t xml:space="preserve"> 實體位置</w:t>
+                  </w:r>
+                </w:p>
+              </w:tc>
+            </w:tr>
+          </w:tbl>
+          <w:p>
+            <w:pPr>
+              <w:rPr>
+                <w:rFonts w:ascii="Verdana" w:hAnsi="Verdana" w:cs="Verdana" w:hint="eastAsia"/>
+                <w:sz w:val="24"/>
+                <w:szCs w:val="24"/>
+                <w:lang w:val="en-US"/>
+              </w:rPr>
+            </w:pPr>
+          </w:p>
+        </w:tc>
+      </w:tr>
+      <w:tr>
+        <w:tc>
+          <w:tcPr>
+            <w:tcW w:w="2254" w:type="dxa"/>
+          </w:tcPr>
+          <w:p>
+            <w:pPr>
+              <w:rPr>
+                <w:rFonts w:ascii="Verdana" w:hAnsi="Verdana" w:cs="Verdana"/>
+                <w:sz w:val="24"/>
+                <w:szCs w:val="24"/>
+                <w:lang w:val="en-US"/>
+              </w:rPr>
+            </w:pPr>
+            <w:r>
+              <w:t>target_id</w:t>
+            </w:r>
+          </w:p>
+        </w:tc>
+        <w:tc>
+          <w:tcPr>
+            <w:tcW w:w="2255" w:type="dxa"/>
+            <w:vAlign w:val="center"/>
+          </w:tcPr>
+          <w:p>
+            <w:pPr>
+              <w:rPr>
+                <w:rFonts w:ascii="Verdana" w:eastAsia="Verdana" w:hAnsi="Verdana" w:cs="Verdana"/>
+                <w:sz w:val="24"/>
+                <w:szCs w:val="24"/>
+                <w:lang w:val="en-US"/>
+              </w:rPr>
+            </w:pPr>
+            <w:r>
+              <w:rPr>
+                <w:rFonts w:ascii="Segoe UI" w:hAnsi="Segoe UI" w:cs="Segoe UI"/>
+                <w:color w:val="1F2328"/>
+                <w:sz w:val="16"/>
+                <w:szCs w:val="16"/>
+              </w:rPr>
+              <w:t>目標</w:t>
+            </w:r>
+            <w:r>
+              <w:rPr>
+                <w:rFonts w:ascii="Segoe UI" w:hAnsi="Segoe UI" w:cs="Segoe UI"/>
+                <w:color w:val="1F2328"/>
+                <w:sz w:val="16"/>
+                <w:szCs w:val="16"/>
+              </w:rPr>
+              <w:t xml:space="preserve"> ID</w:t>
+            </w:r>
+          </w:p>
+        </w:tc>
+        <w:tc>
+          <w:tcPr>
+            <w:tcW w:w="2255" w:type="dxa"/>
+          </w:tcPr>
+          <w:p>
+            <w:pPr>
+              <w:rPr>
+                <w:rFonts w:ascii="Verdana" w:hAnsi="Verdana" w:cs="Verdana" w:hint="eastAsia"/>
+                <w:sz w:val="24"/>
+                <w:szCs w:val="24"/>
+                <w:lang w:val="en-US"/>
+              </w:rPr>
+            </w:pPr>
+            <w:r>
+              <w:t>varchar</w:t>
+            </w:r>
+          </w:p>
+        </w:tc>
+        <w:tc>
+          <w:tcPr>
+            <w:tcW w:w="2255" w:type="dxa"/>
+          </w:tcPr>
+          <w:p>
+            <w:pPr>
+              <w:rPr>
+                <w:rFonts w:ascii="Verdana" w:hAnsi="Verdana" w:cs="Verdana" w:hint="eastAsia"/>
+                <w:sz w:val="24"/>
+                <w:szCs w:val="24"/>
+                <w:lang w:val="en-US"/>
+              </w:rPr>
+            </w:pPr>
+            <w:r>
+              <w:rPr>
+                <w:rFonts w:ascii="Verdana" w:hAnsi="Verdana" w:cs="Verdana" w:hint="eastAsia"/>
+                <w:sz w:val="24"/>
+                <w:szCs w:val="24"/>
+                <w:lang w:val="en-US"/>
+              </w:rPr>
+              <w:t>Nullable</w:t>
+            </w:r>
+          </w:p>
+        </w:tc>
+      </w:tr>
+      <w:tr>
+        <w:tc>
+          <w:tcPr>
+            <w:tcW w:w="2254" w:type="dxa"/>
+          </w:tcPr>
+          <w:p>
+            <w:pPr>
+              <w:rPr>
+                <w:rFonts w:ascii="Verdana" w:hAnsi="Verdana" w:cs="Verdana"/>
+                <w:sz w:val="24"/>
+                <w:szCs w:val="24"/>
+                <w:lang w:val="en-US"/>
+              </w:rPr>
+            </w:pPr>
+            <w:r>
+              <w:t>detail</w:t>
+            </w:r>
+          </w:p>
+        </w:tc>
+        <w:tc>
+          <w:tcPr>
+            <w:tcW w:w="2255" w:type="dxa"/>
+            <w:vAlign w:val="center"/>
+          </w:tcPr>
+          <w:p>
+            <w:pPr>
+              <w:rPr>
+                <w:rFonts w:ascii="Verdana" w:eastAsia="Verdana" w:hAnsi="Verdana" w:cs="Verdana"/>
+                <w:sz w:val="24"/>
+                <w:szCs w:val="24"/>
+                <w:lang w:val="en-US"/>
+              </w:rPr>
+            </w:pPr>
+            <w:r>
+              <w:rPr>
+                <w:rFonts w:ascii="Segoe UI" w:hAnsi="Segoe UI" w:cs="Segoe UI"/>
+                <w:color w:val="1F2328"/>
+                <w:sz w:val="16"/>
+                <w:szCs w:val="16"/>
+              </w:rPr>
+              <w:t>補充資訊</w:t>
+            </w:r>
+          </w:p>
+        </w:tc>
+        <w:tc>
+          <w:tcPr>
+            <w:tcW w:w="2255" w:type="dxa"/>
+          </w:tcPr>
+          <w:p>
+            <w:pPr>
+              <w:rPr>
+                <w:rFonts w:ascii="Verdana" w:eastAsia="Verdana" w:hAnsi="Verdana" w:cs="Verdana"/>
+                <w:sz w:val="24"/>
+                <w:szCs w:val="24"/>
+                <w:lang w:val="en-US"/>
+              </w:rPr>
+            </w:pPr>
+            <w:r>
+              <w:t>jsonb</w:t>
+            </w:r>
+          </w:p>
+        </w:tc>
+        <w:tc>
+          <w:tcPr>
+            <w:tcW w:w="2255" w:type="dxa"/>
+          </w:tcPr>
+          <w:p>
+            <w:pPr>
+              <w:rPr>
+                <w:rFonts w:ascii="Verdana" w:hAnsi="Verdana" w:cs="Verdana" w:hint="eastAsia"/>
+                <w:sz w:val="24"/>
+                <w:szCs w:val="24"/>
+                <w:lang w:val="en-US"/>
+              </w:rPr>
+            </w:pPr>
+            <w:r>
+              <w:rPr>
+                <w:rFonts w:ascii="Verdana" w:hAnsi="Verdana" w:cs="Verdana" w:hint="eastAsia"/>
+                <w:sz w:val="24"/>
+                <w:szCs w:val="24"/>
+                <w:lang w:val="en-US"/>
+              </w:rPr>
+              <w:t>Nullable</w:t>
+            </w:r>
+          </w:p>
+        </w:tc>
+      </w:tr>
+    </w:tbl>
     <w:p>
       <w:pPr>
         <w:rPr>
           <w:rFonts w:ascii="Verdana" w:eastAsia="Verdana" w:hAnsi="Verdana" w:cs="Verdana"/>
           <w:sz w:val="24"/>
           <w:szCs w:val="24"/>
+          <w:lang w:val="en-US"/>
         </w:rPr>
       </w:pPr>
     </w:p>

</xml_diff>

<commit_message>
add delay notification add application tracking remove mock data
</commit_message>
<xml_diff>
--- a/自費醫療補助管理系統_需求規格書.docx
+++ b/自費醫療補助管理系統_需求規格書.docx
@@ -7110,7 +7110,16 @@
                 <w:sz w:val="24"/>
                 <w:szCs w:val="24"/>
               </w:rPr>
-              <w:t>申請方式</w:t>
+              <w:t>申請</w:t>
+            </w:r>
+            <w:r>
+              <w:rPr>
+                <w:rFonts w:ascii="新細明體" w:eastAsia="新細明體" w:hAnsi="新細明體" w:cs="新細明體" w:hint="eastAsia"/>
+                <w:color w:val="181818"/>
+                <w:sz w:val="24"/>
+                <w:szCs w:val="24"/>
+              </w:rPr>
+              <w:t>類別</w:t>
             </w:r>
           </w:p>
         </w:tc>
@@ -7178,39 +7187,129 @@
             </w:pPr>
             <w:r>
               <w:rPr>
-                <w:rFonts w:ascii="Arial Unicode MS" w:eastAsia="Arial Unicode MS" w:hAnsi="Arial Unicode MS" w:cs="Arial Unicode MS"/>
-                <w:sz w:val="24"/>
-                <w:szCs w:val="24"/>
-              </w:rPr>
-              <w:t>1：自提</w:t>
-            </w:r>
-          </w:p>
-          <w:p>
-            <w:pPr>
-              <w:rPr>
-                <w:rFonts w:ascii="Verdana" w:eastAsia="Verdana" w:hAnsi="Verdana" w:cs="Verdana"/>
-                <w:sz w:val="24"/>
-                <w:szCs w:val="24"/>
-              </w:rPr>
-            </w:pPr>
-            <w:r>
-              <w:rPr>
-                <w:rFonts w:ascii="Arial Unicode MS" w:eastAsia="Arial Unicode MS" w:hAnsi="Arial Unicode MS" w:cs="Arial Unicode MS"/>
-                <w:sz w:val="24"/>
-                <w:szCs w:val="24"/>
-              </w:rPr>
-              <w:t>2：轉</w:t>
+                <w:rFonts w:asciiTheme="minorEastAsia" w:hAnsiTheme="minorEastAsia" w:cs="Arial Unicode MS" w:hint="eastAsia"/>
+                <w:sz w:val="24"/>
+                <w:szCs w:val="24"/>
+              </w:rPr>
+              <w:t>A</w:t>
+            </w:r>
+            <w:r>
+              <w:rPr>
+                <w:rFonts w:ascii="Arial Unicode MS" w:eastAsia="Arial Unicode MS" w:hAnsi="Arial Unicode MS" w:cs="Arial Unicode MS"/>
+                <w:sz w:val="24"/>
+                <w:szCs w:val="24"/>
+              </w:rPr>
+              <w:t>：</w:t>
+            </w:r>
+            <w:r>
+              <w:rPr>
+                <w:rFonts w:ascii="新細明體" w:eastAsia="新細明體" w:hAnsi="新細明體" w:cs="新細明體" w:hint="eastAsia"/>
+                <w:sz w:val="24"/>
+                <w:szCs w:val="24"/>
+              </w:rPr>
+              <w:t>自費醫療補助</w:t>
+            </w:r>
+          </w:p>
+          <w:p>
+            <w:pPr>
+              <w:rPr>
+                <w:rFonts w:ascii="Arial Unicode MS" w:hAnsi="Arial Unicode MS" w:cs="Arial Unicode MS" w:hint="eastAsia"/>
+                <w:sz w:val="24"/>
+                <w:szCs w:val="24"/>
+              </w:rPr>
+            </w:pPr>
+            <w:r>
+              <w:rPr>
+                <w:rFonts w:asciiTheme="minorEastAsia" w:hAnsiTheme="minorEastAsia" w:cs="Arial Unicode MS" w:hint="eastAsia"/>
+                <w:sz w:val="24"/>
+                <w:szCs w:val="24"/>
+              </w:rPr>
+              <w:t>B</w:t>
+            </w:r>
+            <w:r>
+              <w:rPr>
+                <w:rFonts w:ascii="Arial Unicode MS" w:eastAsia="Arial Unicode MS" w:hAnsi="Arial Unicode MS" w:cs="Arial Unicode MS"/>
+                <w:sz w:val="24"/>
+                <w:szCs w:val="24"/>
+              </w:rPr>
+              <w:t>：</w:t>
+            </w:r>
+            <w:r>
+              <w:rPr>
+                <w:rFonts w:ascii="新細明體" w:eastAsia="新細明體" w:hAnsi="新細明體" w:cs="新細明體" w:hint="eastAsia"/>
+                <w:sz w:val="24"/>
+                <w:szCs w:val="24"/>
+              </w:rPr>
+              <w:t>臨終安寧自費醫療補助</w:t>
+            </w:r>
+          </w:p>
+          <w:p>
+            <w:pPr>
+              <w:rPr>
+                <w:rFonts w:ascii="Arial Unicode MS" w:hAnsi="Arial Unicode MS" w:cs="Arial Unicode MS"/>
+                <w:sz w:val="24"/>
+                <w:szCs w:val="24"/>
+              </w:rPr>
+            </w:pPr>
+            <w:r>
+              <w:rPr>
+                <w:rFonts w:ascii="Arial Unicode MS" w:hAnsi="Arial Unicode MS" w:cs="Arial Unicode MS" w:hint="eastAsia"/>
+                <w:sz w:val="24"/>
+                <w:szCs w:val="24"/>
+              </w:rPr>
+              <w:t>C</w:t>
+            </w:r>
+            <w:r>
+              <w:rPr>
+                <w:rFonts w:ascii="Arial Unicode MS" w:hAnsi="Arial Unicode MS" w:cs="Arial Unicode MS" w:hint="eastAsia"/>
+                <w:sz w:val="24"/>
+                <w:szCs w:val="24"/>
+              </w:rPr>
+              <w:t>：預立醫療照護諮商補助</w:t>
+            </w:r>
+          </w:p>
+          <w:p>
+            <w:pPr>
+              <w:rPr>
+                <w:rFonts w:ascii="Verdana" w:hAnsi="Verdana" w:cs="Verdana" w:hint="eastAsia"/>
+                <w:sz w:val="24"/>
+                <w:szCs w:val="24"/>
+              </w:rPr>
+            </w:pPr>
+            <w:r>
+              <w:rPr>
+                <w:rFonts w:ascii="Arial Unicode MS" w:hAnsi="Arial Unicode MS" w:cs="Arial Unicode MS" w:hint="eastAsia"/>
+                <w:sz w:val="24"/>
+                <w:szCs w:val="24"/>
+              </w:rPr>
+              <w:t>D</w:t>
+            </w:r>
+            <w:r>
+              <w:rPr>
+                <w:rFonts w:ascii="Arial Unicode MS" w:hAnsi="Arial Unicode MS" w:cs="Arial Unicode MS" w:hint="eastAsia"/>
+                <w:sz w:val="24"/>
+                <w:szCs w:val="24"/>
+              </w:rPr>
+              <w:t>：</w:t>
             </w:r>
             <w:proofErr w:type="gramStart"/>
             <w:r>
               <w:rPr>
-                <w:rFonts w:ascii="Arial Unicode MS" w:eastAsia="Arial Unicode MS" w:hAnsi="Arial Unicode MS" w:cs="Arial Unicode MS"/>
-                <w:sz w:val="24"/>
-                <w:szCs w:val="24"/>
-              </w:rPr>
-              <w:t>介</w:t>
+                <w:rFonts w:ascii="Arial Unicode MS" w:hAnsi="Arial Unicode MS" w:cs="Arial Unicode MS" w:hint="eastAsia"/>
+                <w:sz w:val="24"/>
+                <w:szCs w:val="24"/>
+              </w:rPr>
+              <w:t>醫</w:t>
             </w:r>
             <w:proofErr w:type="gramEnd"/>
+            <w:r>
+              <w:rPr>
+                <w:rFonts w:ascii="Arial Unicode MS" w:hAnsi="Arial Unicode MS" w:cs="Arial Unicode MS" w:hint="eastAsia"/>
+                <w:sz w:val="24"/>
+                <w:szCs w:val="24"/>
+              </w:rPr>
+              <w:t>事人員進修補助</w:t>
+            </w:r>
           </w:p>
         </w:tc>
       </w:tr>
@@ -7238,20 +7337,20 @@
           <w:p>
             <w:pPr>
               <w:rPr>
-                <w:rFonts w:ascii="Verdana" w:eastAsia="Verdana" w:hAnsi="Verdana" w:cs="Verdana"/>
-                <w:color w:val="181818"/>
-                <w:sz w:val="24"/>
-                <w:szCs w:val="24"/>
-              </w:rPr>
-            </w:pPr>
-            <w:r>
-              <w:rPr>
-                <w:rFonts w:ascii="Verdana" w:eastAsia="Verdana" w:hAnsi="Verdana" w:cs="Verdana"/>
-                <w:color w:val="181818"/>
-                <w:sz w:val="24"/>
-                <w:szCs w:val="24"/>
-              </w:rPr>
-              <w:t>social_unit</w:t>
+                <w:rFonts w:ascii="Verdana" w:eastAsia="Verdana" w:hAnsi="Verdana" w:cs="Verdana" w:hint="eastAsia"/>
+                <w:color w:val="181818"/>
+                <w:sz w:val="24"/>
+                <w:szCs w:val="24"/>
+              </w:rPr>
+            </w:pPr>
+            <w:r>
+              <w:rPr>
+                <w:rFonts w:ascii="新細明體" w:eastAsia="新細明體" w:hAnsi="新細明體" w:cs="新細明體" w:hint="eastAsia"/>
+                <w:color w:val="181818"/>
+                <w:sz w:val="24"/>
+                <w:szCs w:val="24"/>
+              </w:rPr>
+              <w:t>application_way</w:t>
             </w:r>
           </w:p>
         </w:tc>
@@ -7275,105 +7374,120 @@
           <w:p>
             <w:pPr>
               <w:rPr>
-                <w:rFonts w:ascii="Verdana" w:eastAsia="Verdana" w:hAnsi="Verdana" w:cs="Verdana"/>
-                <w:color w:val="181818"/>
-                <w:sz w:val="24"/>
-                <w:szCs w:val="24"/>
-              </w:rPr>
-            </w:pPr>
-            <w:r>
-              <w:rPr>
-                <w:rFonts w:ascii="Arial Unicode MS" w:eastAsia="Arial Unicode MS" w:hAnsi="Arial Unicode MS" w:cs="Arial Unicode MS"/>
-                <w:color w:val="181818"/>
-                <w:sz w:val="24"/>
-                <w:szCs w:val="24"/>
-              </w:rPr>
-              <w:t>轉</w:t>
+                <w:rFonts w:ascii="Arial Unicode MS" w:eastAsia="Arial Unicode MS" w:hAnsi="Arial Unicode MS" w:cs="Arial Unicode MS"/>
+                <w:color w:val="181818"/>
+                <w:sz w:val="24"/>
+                <w:szCs w:val="24"/>
+              </w:rPr>
+            </w:pPr>
+            <w:r>
+              <w:rPr>
+                <w:rFonts w:ascii="Arial Unicode MS" w:eastAsia="Arial Unicode MS" w:hAnsi="Arial Unicode MS" w:cs="Arial Unicode MS"/>
+                <w:color w:val="181818"/>
+                <w:sz w:val="24"/>
+                <w:szCs w:val="24"/>
+              </w:rPr>
+              <w:t>申請方式</w:t>
+            </w:r>
+          </w:p>
+        </w:tc>
+        <w:tc>
+          <w:tcPr>
+            <w:tcW w:w="2190" w:type="dxa"/>
+            <w:tcBorders>
+              <w:top w:val="single" w:sz="6" w:space="0" w:color="000000"/>
+              <w:left w:val="single" w:sz="6" w:space="0" w:color="000000"/>
+              <w:bottom w:val="single" w:sz="6" w:space="0" w:color="000000"/>
+              <w:right w:val="single" w:sz="6" w:space="0" w:color="000000"/>
+            </w:tcBorders>
+            <w:tcMar>
+              <w:top w:w="113" w:type="dxa"/>
+              <w:left w:w="113" w:type="dxa"/>
+              <w:bottom w:w="113" w:type="dxa"/>
+              <w:right w:w="113" w:type="dxa"/>
+            </w:tcMar>
+            <w:vAlign w:val="center"/>
+          </w:tcPr>
+          <w:p>
+            <w:pPr>
+              <w:rPr>
+                <w:rFonts w:ascii="Verdana" w:eastAsia="Verdana" w:hAnsi="Verdana" w:cs="Verdana"/>
+                <w:color w:val="181818"/>
+                <w:sz w:val="24"/>
+                <w:szCs w:val="24"/>
+              </w:rPr>
+            </w:pPr>
+            <w:r>
+              <w:rPr>
+                <w:rFonts w:ascii="Verdana" w:eastAsia="Verdana" w:hAnsi="Verdana" w:cs="Verdana"/>
+                <w:color w:val="181818"/>
+                <w:sz w:val="24"/>
+                <w:szCs w:val="24"/>
+              </w:rPr>
+              <w:t>VARCHAR(1)</w:t>
+            </w:r>
+          </w:p>
+        </w:tc>
+        <w:tc>
+          <w:tcPr>
+            <w:tcW w:w="2340" w:type="dxa"/>
+            <w:tcBorders>
+              <w:top w:val="single" w:sz="6" w:space="0" w:color="000000"/>
+              <w:left w:val="single" w:sz="6" w:space="0" w:color="000000"/>
+              <w:bottom w:val="single" w:sz="6" w:space="0" w:color="000000"/>
+              <w:right w:val="single" w:sz="6" w:space="0" w:color="000000"/>
+            </w:tcBorders>
+            <w:tcMar>
+              <w:top w:w="113" w:type="dxa"/>
+              <w:left w:w="113" w:type="dxa"/>
+              <w:bottom w:w="113" w:type="dxa"/>
+              <w:right w:w="113" w:type="dxa"/>
+            </w:tcMar>
+            <w:vAlign w:val="center"/>
+          </w:tcPr>
+          <w:p>
+            <w:pPr>
+              <w:rPr>
+                <w:rFonts w:ascii="Verdana" w:eastAsia="Verdana" w:hAnsi="Verdana" w:cs="Verdana"/>
+                <w:sz w:val="24"/>
+                <w:szCs w:val="24"/>
+              </w:rPr>
+            </w:pPr>
+            <w:r>
+              <w:rPr>
+                <w:rFonts w:ascii="Arial Unicode MS" w:eastAsia="Arial Unicode MS" w:hAnsi="Arial Unicode MS" w:cs="Arial Unicode MS"/>
+                <w:sz w:val="24"/>
+                <w:szCs w:val="24"/>
+              </w:rPr>
+              <w:t>1：自提</w:t>
+            </w:r>
+          </w:p>
+          <w:p>
+            <w:pPr>
+              <w:rPr>
+                <w:rFonts w:ascii="Arial Unicode MS" w:eastAsia="Arial Unicode MS" w:hAnsi="Arial Unicode MS" w:cs="Arial Unicode MS"/>
+                <w:sz w:val="24"/>
+                <w:szCs w:val="24"/>
+              </w:rPr>
+            </w:pPr>
+            <w:r>
+              <w:rPr>
+                <w:rFonts w:ascii="Arial Unicode MS" w:eastAsia="Arial Unicode MS" w:hAnsi="Arial Unicode MS" w:cs="Arial Unicode MS"/>
+                <w:sz w:val="24"/>
+                <w:szCs w:val="24"/>
+              </w:rPr>
+              <w:t>2：轉</w:t>
             </w:r>
             <w:proofErr w:type="gramStart"/>
             <w:r>
               <w:rPr>
                 <w:rFonts w:ascii="Arial Unicode MS" w:eastAsia="Arial Unicode MS" w:hAnsi="Arial Unicode MS" w:cs="Arial Unicode MS"/>
-                <w:color w:val="181818"/>
                 <w:sz w:val="24"/>
                 <w:szCs w:val="24"/>
               </w:rPr>
               <w:t>介</w:t>
             </w:r>
             <w:proofErr w:type="gramEnd"/>
-            <w:r>
-              <w:rPr>
-                <w:rFonts w:ascii="Arial Unicode MS" w:eastAsia="Arial Unicode MS" w:hAnsi="Arial Unicode MS" w:cs="Arial Unicode MS"/>
-                <w:color w:val="181818"/>
-                <w:sz w:val="24"/>
-                <w:szCs w:val="24"/>
-              </w:rPr>
-              <w:t>單位</w:t>
-            </w:r>
-          </w:p>
-        </w:tc>
-        <w:tc>
-          <w:tcPr>
-            <w:tcW w:w="2190" w:type="dxa"/>
-            <w:tcBorders>
-              <w:top w:val="single" w:sz="6" w:space="0" w:color="000000"/>
-              <w:left w:val="single" w:sz="6" w:space="0" w:color="000000"/>
-              <w:bottom w:val="single" w:sz="6" w:space="0" w:color="000000"/>
-              <w:right w:val="single" w:sz="6" w:space="0" w:color="000000"/>
-            </w:tcBorders>
-            <w:tcMar>
-              <w:top w:w="113" w:type="dxa"/>
-              <w:left w:w="113" w:type="dxa"/>
-              <w:bottom w:w="113" w:type="dxa"/>
-              <w:right w:w="113" w:type="dxa"/>
-            </w:tcMar>
-            <w:vAlign w:val="center"/>
-          </w:tcPr>
-          <w:p>
-            <w:pPr>
-              <w:rPr>
-                <w:rFonts w:ascii="Verdana" w:eastAsia="Verdana" w:hAnsi="Verdana" w:cs="Verdana"/>
-                <w:color w:val="181818"/>
-                <w:sz w:val="24"/>
-                <w:szCs w:val="24"/>
-              </w:rPr>
-            </w:pPr>
-            <w:r>
-              <w:rPr>
-                <w:rFonts w:ascii="Verdana" w:eastAsia="Verdana" w:hAnsi="Verdana" w:cs="Verdana"/>
-                <w:color w:val="181818"/>
-                <w:sz w:val="24"/>
-                <w:szCs w:val="24"/>
-              </w:rPr>
-              <w:t>VARCHAR(100)</w:t>
-            </w:r>
-          </w:p>
-        </w:tc>
-        <w:tc>
-          <w:tcPr>
-            <w:tcW w:w="2340" w:type="dxa"/>
-            <w:tcBorders>
-              <w:top w:val="single" w:sz="6" w:space="0" w:color="000000"/>
-              <w:left w:val="single" w:sz="6" w:space="0" w:color="000000"/>
-              <w:bottom w:val="single" w:sz="6" w:space="0" w:color="000000"/>
-              <w:right w:val="single" w:sz="6" w:space="0" w:color="000000"/>
-            </w:tcBorders>
-            <w:tcMar>
-              <w:top w:w="113" w:type="dxa"/>
-              <w:left w:w="113" w:type="dxa"/>
-              <w:bottom w:w="113" w:type="dxa"/>
-              <w:right w:w="113" w:type="dxa"/>
-            </w:tcMar>
-            <w:vAlign w:val="center"/>
-          </w:tcPr>
-          <w:p>
-            <w:pPr>
-              <w:rPr>
-                <w:rFonts w:ascii="Verdana" w:eastAsia="Verdana" w:hAnsi="Verdana" w:cs="Verdana"/>
-                <w:sz w:val="24"/>
-                <w:szCs w:val="24"/>
-              </w:rPr>
-            </w:pPr>
           </w:p>
         </w:tc>
       </w:tr>
@@ -7414,7 +7528,7 @@
                 <w:sz w:val="24"/>
                 <w:szCs w:val="24"/>
               </w:rPr>
-              <w:t>officer_fax</w:t>
+              <w:t>social_unit</w:t>
             </w:r>
           </w:p>
         </w:tc>
@@ -7451,7 +7565,27 @@
                 <w:sz w:val="24"/>
                 <w:szCs w:val="24"/>
               </w:rPr>
-              <w:t>承辦人傳真</w:t>
+              <w:t>轉</w:t>
+            </w:r>
+            <w:proofErr w:type="gramStart"/>
+            <w:r>
+              <w:rPr>
+                <w:rFonts w:ascii="Arial Unicode MS" w:eastAsia="Arial Unicode MS" w:hAnsi="Arial Unicode MS" w:cs="Arial Unicode MS"/>
+                <w:color w:val="181818"/>
+                <w:sz w:val="24"/>
+                <w:szCs w:val="24"/>
+              </w:rPr>
+              <w:t>介</w:t>
+            </w:r>
+            <w:proofErr w:type="gramEnd"/>
+            <w:r>
+              <w:rPr>
+                <w:rFonts w:ascii="Arial Unicode MS" w:eastAsia="Arial Unicode MS" w:hAnsi="Arial Unicode MS" w:cs="Arial Unicode MS"/>
+                <w:color w:val="181818"/>
+                <w:sz w:val="24"/>
+                <w:szCs w:val="24"/>
+              </w:rPr>
+              <w:t>單位</w:t>
             </w:r>
           </w:p>
         </w:tc>
@@ -7488,7 +7622,7 @@
                 <w:sz w:val="24"/>
                 <w:szCs w:val="24"/>
               </w:rPr>
-              <w:t>VARCHAR(20)</w:t>
+              <w:t>VARCHAR(100)</w:t>
             </w:r>
           </w:p>
         </w:tc>
@@ -7557,6 +7691,149 @@
                 <w:sz w:val="24"/>
                 <w:szCs w:val="24"/>
               </w:rPr>
+              <w:t>officer_fax</w:t>
+            </w:r>
+          </w:p>
+        </w:tc>
+        <w:tc>
+          <w:tcPr>
+            <w:tcW w:w="1965" w:type="dxa"/>
+            <w:tcBorders>
+              <w:top w:val="single" w:sz="6" w:space="0" w:color="000000"/>
+              <w:left w:val="single" w:sz="6" w:space="0" w:color="000000"/>
+              <w:bottom w:val="single" w:sz="6" w:space="0" w:color="000000"/>
+              <w:right w:val="single" w:sz="6" w:space="0" w:color="000000"/>
+            </w:tcBorders>
+            <w:tcMar>
+              <w:top w:w="113" w:type="dxa"/>
+              <w:left w:w="113" w:type="dxa"/>
+              <w:bottom w:w="113" w:type="dxa"/>
+              <w:right w:w="113" w:type="dxa"/>
+            </w:tcMar>
+            <w:vAlign w:val="center"/>
+          </w:tcPr>
+          <w:p>
+            <w:pPr>
+              <w:rPr>
+                <w:rFonts w:ascii="Verdana" w:eastAsia="Verdana" w:hAnsi="Verdana" w:cs="Verdana"/>
+                <w:color w:val="181818"/>
+                <w:sz w:val="24"/>
+                <w:szCs w:val="24"/>
+              </w:rPr>
+            </w:pPr>
+            <w:r>
+              <w:rPr>
+                <w:rFonts w:ascii="Arial Unicode MS" w:eastAsia="Arial Unicode MS" w:hAnsi="Arial Unicode MS" w:cs="Arial Unicode MS"/>
+                <w:color w:val="181818"/>
+                <w:sz w:val="24"/>
+                <w:szCs w:val="24"/>
+              </w:rPr>
+              <w:t>承辦人傳真</w:t>
+            </w:r>
+          </w:p>
+        </w:tc>
+        <w:tc>
+          <w:tcPr>
+            <w:tcW w:w="2190" w:type="dxa"/>
+            <w:tcBorders>
+              <w:top w:val="single" w:sz="6" w:space="0" w:color="000000"/>
+              <w:left w:val="single" w:sz="6" w:space="0" w:color="000000"/>
+              <w:bottom w:val="single" w:sz="6" w:space="0" w:color="000000"/>
+              <w:right w:val="single" w:sz="6" w:space="0" w:color="000000"/>
+            </w:tcBorders>
+            <w:tcMar>
+              <w:top w:w="113" w:type="dxa"/>
+              <w:left w:w="113" w:type="dxa"/>
+              <w:bottom w:w="113" w:type="dxa"/>
+              <w:right w:w="113" w:type="dxa"/>
+            </w:tcMar>
+            <w:vAlign w:val="center"/>
+          </w:tcPr>
+          <w:p>
+            <w:pPr>
+              <w:rPr>
+                <w:rFonts w:ascii="Verdana" w:eastAsia="Verdana" w:hAnsi="Verdana" w:cs="Verdana"/>
+                <w:color w:val="181818"/>
+                <w:sz w:val="24"/>
+                <w:szCs w:val="24"/>
+              </w:rPr>
+            </w:pPr>
+            <w:r>
+              <w:rPr>
+                <w:rFonts w:ascii="Verdana" w:eastAsia="Verdana" w:hAnsi="Verdana" w:cs="Verdana"/>
+                <w:color w:val="181818"/>
+                <w:sz w:val="24"/>
+                <w:szCs w:val="24"/>
+              </w:rPr>
+              <w:t>VARCHAR(20)</w:t>
+            </w:r>
+          </w:p>
+        </w:tc>
+        <w:tc>
+          <w:tcPr>
+            <w:tcW w:w="2340" w:type="dxa"/>
+            <w:tcBorders>
+              <w:top w:val="single" w:sz="6" w:space="0" w:color="000000"/>
+              <w:left w:val="single" w:sz="6" w:space="0" w:color="000000"/>
+              <w:bottom w:val="single" w:sz="6" w:space="0" w:color="000000"/>
+              <w:right w:val="single" w:sz="6" w:space="0" w:color="000000"/>
+            </w:tcBorders>
+            <w:tcMar>
+              <w:top w:w="113" w:type="dxa"/>
+              <w:left w:w="113" w:type="dxa"/>
+              <w:bottom w:w="113" w:type="dxa"/>
+              <w:right w:w="113" w:type="dxa"/>
+            </w:tcMar>
+            <w:vAlign w:val="center"/>
+          </w:tcPr>
+          <w:p>
+            <w:pPr>
+              <w:rPr>
+                <w:rFonts w:ascii="Verdana" w:eastAsia="Verdana" w:hAnsi="Verdana" w:cs="Verdana"/>
+                <w:sz w:val="24"/>
+                <w:szCs w:val="24"/>
+              </w:rPr>
+            </w:pPr>
+          </w:p>
+        </w:tc>
+      </w:tr>
+      <w:tr>
+        <w:trPr>
+          <w:trHeight w:val="750"/>
+        </w:trPr>
+        <w:tc>
+          <w:tcPr>
+            <w:tcW w:w="2280" w:type="dxa"/>
+            <w:tcBorders>
+              <w:top w:val="single" w:sz="6" w:space="0" w:color="000000"/>
+              <w:left w:val="single" w:sz="6" w:space="0" w:color="000000"/>
+              <w:bottom w:val="single" w:sz="6" w:space="0" w:color="000000"/>
+              <w:right w:val="single" w:sz="6" w:space="0" w:color="000000"/>
+            </w:tcBorders>
+            <w:tcMar>
+              <w:top w:w="113" w:type="dxa"/>
+              <w:left w:w="113" w:type="dxa"/>
+              <w:bottom w:w="113" w:type="dxa"/>
+              <w:right w:w="113" w:type="dxa"/>
+            </w:tcMar>
+            <w:vAlign w:val="center"/>
+          </w:tcPr>
+          <w:p>
+            <w:pPr>
+              <w:rPr>
+                <w:rFonts w:ascii="Verdana" w:eastAsia="Verdana" w:hAnsi="Verdana" w:cs="Verdana"/>
+                <w:color w:val="181818"/>
+                <w:sz w:val="24"/>
+                <w:szCs w:val="24"/>
+              </w:rPr>
+            </w:pPr>
+            <w:r>
+              <w:rPr>
+                <w:rFonts w:ascii="Verdana" w:eastAsia="Verdana" w:hAnsi="Verdana" w:cs="Verdana"/>
+                <w:color w:val="181818"/>
+                <w:sz w:val="24"/>
+                <w:szCs w:val="24"/>
+              </w:rPr>
               <w:t>apply_at</w:t>
             </w:r>
           </w:p>
@@ -8071,6 +8348,7 @@
                 <w:sz w:val="24"/>
                 <w:szCs w:val="24"/>
               </w:rPr>
+              <w:lastRenderedPageBreak/>
               <w:t>approved_amount</w:t>
             </w:r>
           </w:p>
@@ -8502,7 +8780,6 @@
                 <w:sz w:val="24"/>
                 <w:szCs w:val="24"/>
               </w:rPr>
-              <w:lastRenderedPageBreak/>
               <w:t>treatment_stage</w:t>
             </w:r>
           </w:p>
@@ -8903,16 +9180,7 @@
                 <w:sz w:val="24"/>
                 <w:szCs w:val="24"/>
               </w:rPr>
-              <w:t xml:space="preserve"> underage </w:t>
-            </w:r>
-            <w:r>
-              <w:rPr>
-                <w:rFonts w:ascii="Verdana" w:eastAsia="Verdana" w:hAnsi="Verdana" w:cs="Verdana"/>
-                <w:color w:val="181818"/>
-                <w:sz w:val="24"/>
-                <w:szCs w:val="24"/>
-              </w:rPr>
-              <w:t>_children</w:t>
+              <w:t xml:space="preserve"> underage _children</w:t>
             </w:r>
           </w:p>
         </w:tc>
@@ -9824,6 +10092,7 @@
                 <w:sz w:val="24"/>
                 <w:szCs w:val="24"/>
               </w:rPr>
+              <w:lastRenderedPageBreak/>
               <w:t>4：子女提供</w:t>
             </w:r>
           </w:p>
@@ -9898,6 +10167,7 @@
                 <w:sz w:val="24"/>
                 <w:szCs w:val="24"/>
               </w:rPr>
+              <w:lastRenderedPageBreak/>
               <w:t>economic_source_other</w:t>
             </w:r>
           </w:p>
@@ -10041,7 +10311,6 @@
                 <w:sz w:val="24"/>
                 <w:szCs w:val="24"/>
               </w:rPr>
-              <w:lastRenderedPageBreak/>
               <w:t>ins_nhi</w:t>
             </w:r>
           </w:p>
@@ -11526,6 +11795,7 @@
                 <w:sz w:val="24"/>
                 <w:szCs w:val="24"/>
               </w:rPr>
+              <w:lastRenderedPageBreak/>
               <w:t>living_status_other</w:t>
             </w:r>
           </w:p>
@@ -11806,7 +12076,6 @@
                 <w:sz w:val="24"/>
                 <w:szCs w:val="24"/>
               </w:rPr>
-              <w:lastRenderedPageBreak/>
               <w:t>treatment_targeted</w:t>
             </w:r>
           </w:p>
@@ -13054,6 +13323,7 @@
                 <w:sz w:val="24"/>
                 <w:szCs w:val="24"/>
               </w:rPr>
+              <w:lastRenderedPageBreak/>
               <w:t>application_id</w:t>
             </w:r>
           </w:p>
@@ -13541,7 +13811,6 @@
                 <w:sz w:val="24"/>
                 <w:szCs w:val="24"/>
               </w:rPr>
-              <w:lastRenderedPageBreak/>
               <w:t>name</w:t>
             </w:r>
           </w:p>
@@ -23114,7 +23383,7 @@
           <w:p>
             <w:pPr>
               <w:rPr>
-                <w:rFonts w:ascii="Verdana" w:hAnsi="Verdana" w:cs="Verdana" w:hint="eastAsia"/>
+                <w:rFonts w:ascii="Verdana" w:hAnsi="Verdana" w:cs="Verdana"/>
                 <w:sz w:val="24"/>
                 <w:szCs w:val="24"/>
                 <w:lang w:val="en-US"/>
@@ -23315,7 +23584,7 @@
           <w:p>
             <w:pPr>
               <w:rPr>
-                <w:rFonts w:ascii="Verdana" w:hAnsi="Verdana" w:cs="Verdana" w:hint="eastAsia"/>
+                <w:rFonts w:ascii="Verdana" w:hAnsi="Verdana" w:cs="Verdana"/>
                 <w:sz w:val="24"/>
                 <w:szCs w:val="24"/>
                 <w:lang w:val="en-US"/>
@@ -23384,7 +23653,7 @@
           <w:p>
             <w:pPr>
               <w:rPr>
-                <w:rFonts w:ascii="Verdana" w:hAnsi="Verdana" w:cs="Verdana" w:hint="eastAsia"/>
+                <w:rFonts w:ascii="Verdana" w:hAnsi="Verdana" w:cs="Verdana"/>
                 <w:sz w:val="24"/>
                 <w:szCs w:val="24"/>
                 <w:lang w:val="en-US"/>
@@ -23487,7 +23756,7 @@
                   <w:pPr>
                     <w:spacing w:line="240" w:lineRule="auto"/>
                     <w:rPr>
-                      <w:rFonts w:ascii="新細明體" w:eastAsia="新細明體" w:hAnsi="新細明體" w:cs="新細明體" w:hint="eastAsia"/>
+                      <w:rFonts w:ascii="新細明體" w:eastAsia="新細明體" w:hAnsi="新細明體" w:cs="新細明體"/>
                       <w:color w:val="000000"/>
                       <w:sz w:val="24"/>
                       <w:szCs w:val="24"/>
@@ -23541,7 +23810,7 @@
                   <w:pPr>
                     <w:spacing w:line="240" w:lineRule="auto"/>
                     <w:rPr>
-                      <w:rFonts w:ascii="新細明體" w:eastAsia="新細明體" w:hAnsi="新細明體" w:cs="新細明體" w:hint="eastAsia"/>
+                      <w:rFonts w:ascii="新細明體" w:eastAsia="新細明體" w:hAnsi="新細明體" w:cs="新細明體"/>
                       <w:color w:val="000000"/>
                       <w:sz w:val="24"/>
                       <w:szCs w:val="24"/>
@@ -23595,7 +23864,7 @@
                   <w:pPr>
                     <w:spacing w:line="240" w:lineRule="auto"/>
                     <w:rPr>
-                      <w:rFonts w:ascii="新細明體" w:eastAsia="新細明體" w:hAnsi="新細明體" w:cs="新細明體" w:hint="eastAsia"/>
+                      <w:rFonts w:ascii="新細明體" w:eastAsia="新細明體" w:hAnsi="新細明體" w:cs="新細明體"/>
                       <w:color w:val="000000"/>
                       <w:sz w:val="24"/>
                       <w:szCs w:val="24"/>
@@ -23649,7 +23918,7 @@
                   <w:pPr>
                     <w:spacing w:line="240" w:lineRule="auto"/>
                     <w:rPr>
-                      <w:rFonts w:ascii="新細明體" w:eastAsia="新細明體" w:hAnsi="新細明體" w:cs="新細明體" w:hint="eastAsia"/>
+                      <w:rFonts w:ascii="新細明體" w:eastAsia="新細明體" w:hAnsi="新細明體" w:cs="新細明體"/>
                       <w:color w:val="000000"/>
                       <w:sz w:val="24"/>
                       <w:szCs w:val="24"/>
@@ -23715,7 +23984,7 @@
                   <w:pPr>
                     <w:spacing w:line="240" w:lineRule="auto"/>
                     <w:rPr>
-                      <w:rFonts w:ascii="新細明體" w:eastAsia="新細明體" w:hAnsi="新細明體" w:cs="新細明體" w:hint="eastAsia"/>
+                      <w:rFonts w:ascii="新細明體" w:eastAsia="新細明體" w:hAnsi="新細明體" w:cs="新細明體"/>
                       <w:color w:val="000000"/>
                       <w:sz w:val="24"/>
                       <w:szCs w:val="24"/>
@@ -23769,7 +24038,7 @@
                   <w:pPr>
                     <w:spacing w:line="240" w:lineRule="auto"/>
                     <w:rPr>
-                      <w:rFonts w:ascii="新細明體" w:eastAsia="新細明體" w:hAnsi="新細明體" w:cs="新細明體" w:hint="eastAsia"/>
+                      <w:rFonts w:ascii="新細明體" w:eastAsia="新細明體" w:hAnsi="新細明體" w:cs="新細明體"/>
                       <w:color w:val="000000"/>
                       <w:sz w:val="24"/>
                       <w:szCs w:val="24"/>
@@ -23824,7 +24093,7 @@
                   <w:pPr>
                     <w:spacing w:line="240" w:lineRule="auto"/>
                     <w:rPr>
-                      <w:rFonts w:ascii="新細明體" w:eastAsia="新細明體" w:hAnsi="新細明體" w:cs="新細明體" w:hint="eastAsia"/>
+                      <w:rFonts w:ascii="新細明體" w:eastAsia="新細明體" w:hAnsi="新細明體" w:cs="新細明體"/>
                       <w:color w:val="000000"/>
                       <w:sz w:val="24"/>
                       <w:szCs w:val="24"/>
@@ -23878,7 +24147,7 @@
                   <w:pPr>
                     <w:spacing w:line="240" w:lineRule="auto"/>
                     <w:rPr>
-                      <w:rFonts w:ascii="新細明體" w:eastAsia="新細明體" w:hAnsi="新細明體" w:cs="新細明體" w:hint="eastAsia"/>
+                      <w:rFonts w:ascii="新細明體" w:eastAsia="新細明體" w:hAnsi="新細明體" w:cs="新細明體"/>
                       <w:color w:val="000000"/>
                       <w:sz w:val="24"/>
                       <w:szCs w:val="24"/>
@@ -23932,7 +24201,7 @@
                   <w:pPr>
                     <w:spacing w:line="240" w:lineRule="auto"/>
                     <w:rPr>
-                      <w:rFonts w:ascii="新細明體" w:eastAsia="新細明體" w:hAnsi="新細明體" w:cs="新細明體" w:hint="eastAsia"/>
+                      <w:rFonts w:ascii="新細明體" w:eastAsia="新細明體" w:hAnsi="新細明體" w:cs="新細明體"/>
                       <w:color w:val="000000"/>
                       <w:sz w:val="24"/>
                       <w:szCs w:val="24"/>
@@ -23986,7 +24255,7 @@
                   <w:pPr>
                     <w:spacing w:line="240" w:lineRule="auto"/>
                     <w:rPr>
-                      <w:rFonts w:ascii="新細明體" w:eastAsia="新細明體" w:hAnsi="新細明體" w:cs="新細明體" w:hint="eastAsia"/>
+                      <w:rFonts w:ascii="新細明體" w:eastAsia="新細明體" w:hAnsi="新細明體" w:cs="新細明體"/>
                       <w:color w:val="000000"/>
                       <w:sz w:val="24"/>
                       <w:szCs w:val="24"/>
@@ -24040,7 +24309,7 @@
                   <w:pPr>
                     <w:spacing w:line="240" w:lineRule="auto"/>
                     <w:rPr>
-                      <w:rFonts w:ascii="新細明體" w:eastAsia="新細明體" w:hAnsi="新細明體" w:cs="新細明體" w:hint="eastAsia"/>
+                      <w:rFonts w:ascii="新細明體" w:eastAsia="新細明體" w:hAnsi="新細明體" w:cs="新細明體"/>
                       <w:color w:val="000000"/>
                       <w:sz w:val="24"/>
                       <w:szCs w:val="24"/>
@@ -24094,7 +24363,7 @@
                   <w:pPr>
                     <w:spacing w:line="240" w:lineRule="auto"/>
                     <w:rPr>
-                      <w:rFonts w:ascii="新細明體" w:eastAsia="新細明體" w:hAnsi="新細明體" w:cs="新細明體" w:hint="eastAsia"/>
+                      <w:rFonts w:ascii="新細明體" w:eastAsia="新細明體" w:hAnsi="新細明體" w:cs="新細明體"/>
                       <w:color w:val="000000"/>
                       <w:sz w:val="24"/>
                       <w:szCs w:val="24"/>
@@ -24148,7 +24417,7 @@
                   <w:pPr>
                     <w:spacing w:line="240" w:lineRule="auto"/>
                     <w:rPr>
-                      <w:rFonts w:ascii="新細明體" w:eastAsia="新細明體" w:hAnsi="新細明體" w:cs="新細明體" w:hint="eastAsia"/>
+                      <w:rFonts w:ascii="新細明體" w:eastAsia="新細明體" w:hAnsi="新細明體" w:cs="新細明體"/>
                       <w:color w:val="000000"/>
                       <w:sz w:val="24"/>
                       <w:szCs w:val="24"/>
@@ -24202,7 +24471,7 @@
                   <w:pPr>
                     <w:spacing w:line="240" w:lineRule="auto"/>
                     <w:rPr>
-                      <w:rFonts w:ascii="新細明體" w:eastAsia="新細明體" w:hAnsi="新細明體" w:cs="新細明體" w:hint="eastAsia"/>
+                      <w:rFonts w:ascii="新細明體" w:eastAsia="新細明體" w:hAnsi="新細明體" w:cs="新細明體"/>
                       <w:color w:val="000000"/>
                       <w:sz w:val="24"/>
                       <w:szCs w:val="24"/>
@@ -24256,7 +24525,7 @@
                   <w:pPr>
                     <w:spacing w:line="240" w:lineRule="auto"/>
                     <w:rPr>
-                      <w:rFonts w:ascii="新細明體" w:eastAsia="新細明體" w:hAnsi="新細明體" w:cs="新細明體" w:hint="eastAsia"/>
+                      <w:rFonts w:ascii="新細明體" w:eastAsia="新細明體" w:hAnsi="新細明體" w:cs="新細明體"/>
                       <w:color w:val="000000"/>
                       <w:sz w:val="24"/>
                       <w:szCs w:val="24"/>
@@ -24310,7 +24579,7 @@
                   <w:pPr>
                     <w:spacing w:line="240" w:lineRule="auto"/>
                     <w:rPr>
-                      <w:rFonts w:ascii="新細明體" w:eastAsia="新細明體" w:hAnsi="新細明體" w:cs="新細明體" w:hint="eastAsia"/>
+                      <w:rFonts w:ascii="新細明體" w:eastAsia="新細明體" w:hAnsi="新細明體" w:cs="新細明體"/>
                       <w:color w:val="000000"/>
                       <w:sz w:val="24"/>
                       <w:szCs w:val="24"/>
@@ -24364,7 +24633,7 @@
                   <w:pPr>
                     <w:spacing w:line="240" w:lineRule="auto"/>
                     <w:rPr>
-                      <w:rFonts w:ascii="新細明體" w:eastAsia="新細明體" w:hAnsi="新細明體" w:cs="新細明體" w:hint="eastAsia"/>
+                      <w:rFonts w:ascii="新細明體" w:eastAsia="新細明體" w:hAnsi="新細明體" w:cs="新細明體"/>
                       <w:color w:val="000000"/>
                       <w:sz w:val="24"/>
                       <w:szCs w:val="24"/>
@@ -24418,7 +24687,7 @@
                   <w:pPr>
                     <w:spacing w:line="240" w:lineRule="auto"/>
                     <w:rPr>
-                      <w:rFonts w:ascii="新細明體" w:eastAsia="新細明體" w:hAnsi="新細明體" w:cs="新細明體" w:hint="eastAsia"/>
+                      <w:rFonts w:ascii="新細明體" w:eastAsia="新細明體" w:hAnsi="新細明體" w:cs="新細明體"/>
                       <w:color w:val="000000"/>
                       <w:sz w:val="24"/>
                       <w:szCs w:val="24"/>
@@ -24472,7 +24741,7 @@
                   <w:pPr>
                     <w:spacing w:line="240" w:lineRule="auto"/>
                     <w:rPr>
-                      <w:rFonts w:ascii="新細明體" w:eastAsia="新細明體" w:hAnsi="新細明體" w:cs="新細明體" w:hint="eastAsia"/>
+                      <w:rFonts w:ascii="新細明體" w:eastAsia="新細明體" w:hAnsi="新細明體" w:cs="新細明體"/>
                       <w:color w:val="000000"/>
                       <w:sz w:val="24"/>
                       <w:szCs w:val="24"/>
@@ -24569,7 +24838,7 @@
           <w:p>
             <w:pPr>
               <w:rPr>
-                <w:rFonts w:ascii="Verdana" w:hAnsi="Verdana" w:cs="Verdana" w:hint="eastAsia"/>
+                <w:rFonts w:ascii="Verdana" w:hAnsi="Verdana" w:cs="Verdana"/>
                 <w:sz w:val="24"/>
                 <w:szCs w:val="24"/>
                 <w:lang w:val="en-US"/>
@@ -24660,7 +24929,7 @@
                   <w:pPr>
                     <w:spacing w:line="240" w:lineRule="auto"/>
                     <w:rPr>
-                      <w:rFonts w:ascii="新細明體" w:eastAsia="新細明體" w:hAnsi="新細明體" w:cs="新細明體" w:hint="eastAsia"/>
+                      <w:rFonts w:ascii="新細明體" w:eastAsia="新細明體" w:hAnsi="新細明體" w:cs="新細明體"/>
                       <w:color w:val="000000"/>
                       <w:sz w:val="24"/>
                       <w:szCs w:val="24"/>
@@ -24714,7 +24983,7 @@
                   <w:pPr>
                     <w:spacing w:line="240" w:lineRule="auto"/>
                     <w:rPr>
-                      <w:rFonts w:ascii="新細明體" w:eastAsia="新細明體" w:hAnsi="新細明體" w:cs="新細明體" w:hint="eastAsia"/>
+                      <w:rFonts w:ascii="新細明體" w:eastAsia="新細明體" w:hAnsi="新細明體" w:cs="新細明體"/>
                       <w:color w:val="000000"/>
                       <w:sz w:val="24"/>
                       <w:szCs w:val="24"/>
@@ -24756,7 +25025,7 @@
                   <w:pPr>
                     <w:spacing w:line="240" w:lineRule="auto"/>
                     <w:rPr>
-                      <w:rFonts w:ascii="新細明體" w:eastAsia="新細明體" w:hAnsi="新細明體" w:cs="新細明體" w:hint="eastAsia"/>
+                      <w:rFonts w:ascii="新細明體" w:eastAsia="新細明體" w:hAnsi="新細明體" w:cs="新細明體"/>
                       <w:color w:val="000000"/>
                       <w:sz w:val="24"/>
                       <w:szCs w:val="24"/>
@@ -24798,7 +25067,7 @@
                   <w:pPr>
                     <w:spacing w:line="240" w:lineRule="auto"/>
                     <w:rPr>
-                      <w:rFonts w:ascii="新細明體" w:eastAsia="新細明體" w:hAnsi="新細明體" w:cs="新細明體" w:hint="eastAsia"/>
+                      <w:rFonts w:ascii="新細明體" w:eastAsia="新細明體" w:hAnsi="新細明體" w:cs="新細明體"/>
                       <w:color w:val="000000"/>
                       <w:sz w:val="24"/>
                       <w:szCs w:val="24"/>
@@ -24834,7 +25103,7 @@
           <w:p>
             <w:pPr>
               <w:rPr>
-                <w:rFonts w:ascii="Verdana" w:hAnsi="Verdana" w:cs="Verdana" w:hint="eastAsia"/>
+                <w:rFonts w:ascii="Verdana" w:hAnsi="Verdana" w:cs="Verdana"/>
                 <w:sz w:val="24"/>
                 <w:szCs w:val="24"/>
                 <w:lang w:val="en-US"/>
@@ -24903,7 +25172,7 @@
           <w:p>
             <w:pPr>
               <w:rPr>
-                <w:rFonts w:ascii="Verdana" w:hAnsi="Verdana" w:cs="Verdana" w:hint="eastAsia"/>
+                <w:rFonts w:ascii="Verdana" w:hAnsi="Verdana" w:cs="Verdana"/>
                 <w:sz w:val="24"/>
                 <w:szCs w:val="24"/>
                 <w:lang w:val="en-US"/>
@@ -24921,7 +25190,7 @@
           <w:p>
             <w:pPr>
               <w:rPr>
-                <w:rFonts w:ascii="Verdana" w:hAnsi="Verdana" w:cs="Verdana" w:hint="eastAsia"/>
+                <w:rFonts w:ascii="Verdana" w:hAnsi="Verdana" w:cs="Verdana"/>
                 <w:sz w:val="24"/>
                 <w:szCs w:val="24"/>
                 <w:lang w:val="en-US"/>
@@ -25008,7 +25277,7 @@
           <w:p>
             <w:pPr>
               <w:rPr>
-                <w:rFonts w:ascii="Verdana" w:hAnsi="Verdana" w:cs="Verdana" w:hint="eastAsia"/>
+                <w:rFonts w:ascii="Verdana" w:hAnsi="Verdana" w:cs="Verdana"/>
                 <w:sz w:val="24"/>
                 <w:szCs w:val="24"/>
                 <w:lang w:val="en-US"/>

</xml_diff>